<commit_message>
Korrektursprache Englisch (Vereinigtes Königreich) gewählt. Closes #3
</commit_message>
<xml_diff>
--- a/IDA/Vorlage (EN) für IDA-SJ2627.docx
+++ b/IDA/Vorlage (EN) für IDA-SJ2627.docx
@@ -4,75 +4,107 @@
   <w:body>
     <w:p>
       <w:pPr>
-        <w:pStyle w:val="Title"/>
-      </w:pPr>
-      <w:r>
-        <w:t xml:space="preserve">Title </w:t>
-      </w:r>
-      <w:proofErr w:type="spellStart"/>
-      <w:r>
-        <w:t>page</w:t>
-      </w:r>
-      <w:proofErr w:type="spellEnd"/>
-    </w:p>
-    <w:p>
-      <w:pPr>
-        <w:pStyle w:val="Subtitle"/>
-      </w:pPr>
-      <w:proofErr w:type="spellStart"/>
-      <w:r>
+        <w:pStyle w:val="Titel"/>
+        <w:rPr>
+          <w:lang w:val="de-CH"/>
+        </w:rPr>
+      </w:pPr>
+      <w:r>
+        <w:rPr>
+          <w:lang w:val="de-CH"/>
+        </w:rPr>
+        <w:t>Title page</w:t>
+      </w:r>
+    </w:p>
+    <w:p>
+      <w:pPr>
+        <w:pStyle w:val="Untertitel"/>
+        <w:rPr>
+          <w:lang w:val="de-CH"/>
+        </w:rPr>
+      </w:pPr>
+      <w:r>
+        <w:rPr>
+          <w:lang w:val="de-CH"/>
+        </w:rPr>
         <w:t>subtitle</w:t>
       </w:r>
-      <w:proofErr w:type="spellEnd"/>
     </w:p>
     <w:p>
       <w:pPr>
         <w:spacing w:after="0" w:line="240" w:lineRule="auto"/>
         <w:jc w:val="center"/>
+        <w:rPr>
+          <w:lang w:val="de-CH"/>
+        </w:rPr>
       </w:pPr>
     </w:p>
     <w:p>
       <w:pPr>
         <w:spacing w:after="0" w:line="240" w:lineRule="auto"/>
         <w:jc w:val="center"/>
+        <w:rPr>
+          <w:lang w:val="de-CH"/>
+        </w:rPr>
       </w:pPr>
     </w:p>
     <w:p>
       <w:pPr>
         <w:spacing w:after="0" w:line="240" w:lineRule="auto"/>
         <w:jc w:val="center"/>
+        <w:rPr>
+          <w:lang w:val="de-CH"/>
+        </w:rPr>
       </w:pPr>
     </w:p>
     <w:p>
       <w:pPr>
         <w:spacing w:after="0" w:line="240" w:lineRule="auto"/>
         <w:jc w:val="center"/>
+        <w:rPr>
+          <w:lang w:val="de-CH"/>
+        </w:rPr>
       </w:pPr>
     </w:p>
     <w:p>
       <w:pPr>
         <w:spacing w:after="0" w:line="240" w:lineRule="auto"/>
         <w:jc w:val="center"/>
+        <w:rPr>
+          <w:lang w:val="de-CH"/>
+        </w:rPr>
       </w:pPr>
     </w:p>
     <w:p>
       <w:pPr>
         <w:spacing w:after="0" w:line="240" w:lineRule="auto"/>
         <w:jc w:val="center"/>
+        <w:rPr>
+          <w:lang w:val="de-CH"/>
+        </w:rPr>
       </w:pPr>
     </w:p>
     <w:p>
       <w:pPr>
         <w:spacing w:after="0" w:line="240" w:lineRule="auto"/>
         <w:jc w:val="center"/>
+        <w:rPr>
+          <w:lang w:val="de-CH"/>
+        </w:rPr>
       </w:pPr>
     </w:p>
     <w:p>
       <w:pPr>
         <w:spacing w:after="0" w:line="240" w:lineRule="auto"/>
         <w:jc w:val="center"/>
-      </w:pPr>
-      <w:r>
+        <w:rPr>
+          <w:lang w:val="de-CH"/>
+        </w:rPr>
+      </w:pPr>
+      <w:r>
+        <w:rPr>
+          <w:lang w:val="de-CH"/>
+        </w:rPr>
         <w:t>INTERDISZIPLINÄRE ARBEIT (IDA)</w:t>
       </w:r>
     </w:p>
@@ -80,20 +112,11 @@
       <w:pPr>
         <w:spacing w:after="0" w:line="240" w:lineRule="auto"/>
         <w:jc w:val="center"/>
-        <w:rPr>
-          <w:lang w:val="en-GB"/>
-        </w:rPr>
-      </w:pPr>
-      <w:r>
-        <w:rPr>
-          <w:lang w:val="en-GB"/>
-        </w:rPr>
+      </w:pPr>
+      <w:r>
         <w:t>In accordance with the cantonal regul</w:t>
       </w:r>
       <w:r>
-        <w:rPr>
-          <w:lang w:val="en-GB"/>
-        </w:rPr>
         <w:t xml:space="preserve">ations of the Canton of Grisons and the </w:t>
       </w:r>
     </w:p>
@@ -101,14 +124,8 @@
       <w:pPr>
         <w:spacing w:after="0" w:line="240" w:lineRule="auto"/>
         <w:jc w:val="center"/>
-        <w:rPr>
-          <w:lang w:val="en-GB"/>
-        </w:rPr>
-      </w:pPr>
-      <w:r>
-        <w:rPr>
-          <w:lang w:val="en-GB"/>
-        </w:rPr>
+      </w:pPr>
+      <w:r>
         <w:t>GKD specifications</w:t>
       </w:r>
     </w:p>
@@ -116,54 +133,36 @@
       <w:pPr>
         <w:spacing w:after="0" w:line="240" w:lineRule="auto"/>
         <w:jc w:val="center"/>
-        <w:rPr>
-          <w:lang w:val="en-GB"/>
-        </w:rPr>
       </w:pPr>
     </w:p>
     <w:p>
       <w:pPr>
         <w:spacing w:after="0" w:line="240" w:lineRule="auto"/>
         <w:jc w:val="center"/>
-        <w:rPr>
-          <w:lang w:val="en-GB"/>
-        </w:rPr>
       </w:pPr>
     </w:p>
     <w:p>
       <w:pPr>
         <w:spacing w:after="0" w:line="240" w:lineRule="auto"/>
         <w:jc w:val="center"/>
-        <w:rPr>
-          <w:lang w:val="en-GB"/>
-        </w:rPr>
       </w:pPr>
     </w:p>
     <w:p>
       <w:pPr>
         <w:spacing w:after="0" w:line="240" w:lineRule="auto"/>
         <w:jc w:val="center"/>
-        <w:rPr>
-          <w:lang w:val="en-GB"/>
-        </w:rPr>
       </w:pPr>
     </w:p>
     <w:p>
       <w:pPr>
         <w:spacing w:after="0" w:line="240" w:lineRule="auto"/>
         <w:jc w:val="center"/>
-        <w:rPr>
-          <w:lang w:val="en-GB"/>
-        </w:rPr>
       </w:pPr>
     </w:p>
     <w:p>
       <w:pPr>
         <w:spacing w:after="0" w:line="240" w:lineRule="auto"/>
         <w:jc w:val="center"/>
-        <w:rPr>
-          <w:lang w:val="en-GB"/>
-        </w:rPr>
       </w:pPr>
     </w:p>
     <w:p>
@@ -181,13 +180,8 @@
       </w:r>
       <w:proofErr w:type="spellEnd"/>
       <w:r>
-        <w:t xml:space="preserve"> </w:t>
-      </w:r>
-      <w:proofErr w:type="spellStart"/>
-      <w:r>
-        <w:t>by</w:t>
-      </w:r>
-      <w:proofErr w:type="spellEnd"/>
+        <w:t xml:space="preserve"> by</w:t>
+      </w:r>
     </w:p>
     <w:p>
       <w:pPr>
@@ -256,13 +250,11 @@
         <w:jc w:val="center"/>
         <w:rPr>
           <w:szCs w:val="26"/>
-          <w:lang w:val="en-GB"/>
         </w:rPr>
       </w:pPr>
       <w:r>
         <w:rPr>
           <w:szCs w:val="26"/>
-          <w:lang w:val="en-GB"/>
         </w:rPr>
         <w:t>from</w:t>
       </w:r>
@@ -277,7 +269,6 @@
         <w:jc w:val="center"/>
         <w:rPr>
           <w:szCs w:val="26"/>
-          <w:lang w:val="en-GB"/>
         </w:rPr>
       </w:pPr>
     </w:p>
@@ -292,13 +283,11 @@
         <w:rPr>
           <w:b/>
           <w:szCs w:val="26"/>
-          <w:lang w:val="en-GB"/>
         </w:rPr>
       </w:pPr>
       <w:r>
         <w:rPr>
           <w:szCs w:val="26"/>
-          <w:lang w:val="en-GB"/>
         </w:rPr>
         <w:t>‘</w:t>
       </w:r>
@@ -306,7 +295,6 @@
       <w:r>
         <w:rPr>
           <w:szCs w:val="26"/>
-          <w:lang w:val="en-GB"/>
         </w:rPr>
         <w:t>Bürgerort</w:t>
       </w:r>
@@ -314,28 +302,24 @@
       <w:r>
         <w:rPr>
           <w:szCs w:val="26"/>
-          <w:lang w:val="en-GB"/>
         </w:rPr>
         <w:t>’</w:t>
       </w:r>
       <w:r>
         <w:rPr>
           <w:szCs w:val="26"/>
-          <w:lang w:val="en-GB"/>
         </w:rPr>
         <w:t xml:space="preserve"> / </w:t>
       </w:r>
       <w:r>
         <w:rPr>
           <w:szCs w:val="26"/>
-          <w:lang w:val="en-GB"/>
         </w:rPr>
         <w:t>c</w:t>
       </w:r>
       <w:r>
         <w:rPr>
           <w:szCs w:val="26"/>
-          <w:lang w:val="en-GB"/>
         </w:rPr>
         <w:t>ountry</w:t>
       </w:r>
@@ -350,7 +334,6 @@
         <w:jc w:val="center"/>
         <w:rPr>
           <w:szCs w:val="26"/>
-          <w:lang w:val="en-GB"/>
         </w:rPr>
       </w:pPr>
     </w:p>
@@ -364,7 +347,6 @@
         <w:jc w:val="center"/>
         <w:rPr>
           <w:szCs w:val="26"/>
-          <w:lang w:val="en-GB"/>
         </w:rPr>
       </w:pPr>
     </w:p>
@@ -372,33 +354,18 @@
       <w:pPr>
         <w:spacing w:after="0" w:line="240" w:lineRule="auto"/>
         <w:jc w:val="center"/>
-        <w:rPr>
-          <w:lang w:val="en-GB"/>
-        </w:rPr>
-      </w:pPr>
-      <w:r>
-        <w:rPr>
-          <w:lang w:val="en-GB"/>
-        </w:rPr>
+      </w:pPr>
+      <w:r>
         <w:t>a</w:t>
       </w:r>
       <w:r>
-        <w:rPr>
-          <w:lang w:val="en-GB"/>
-        </w:rPr>
         <w:t>t</w:t>
       </w:r>
       <w:r>
-        <w:rPr>
-          <w:lang w:val="en-GB"/>
-        </w:rPr>
         <w:t xml:space="preserve"> Gymnasium Kloster </w:t>
       </w:r>
       <w:proofErr w:type="spellStart"/>
       <w:r>
-        <w:rPr>
-          <w:lang w:val="en-GB"/>
-        </w:rPr>
         <w:t>Disentis</w:t>
       </w:r>
       <w:proofErr w:type="spellEnd"/>
@@ -413,7 +380,6 @@
         <w:jc w:val="center"/>
         <w:rPr>
           <w:szCs w:val="26"/>
-          <w:lang w:val="en-GB"/>
         </w:rPr>
       </w:pPr>
     </w:p>
@@ -427,7 +393,6 @@
         <w:jc w:val="center"/>
         <w:rPr>
           <w:szCs w:val="26"/>
-          <w:lang w:val="en-GB"/>
         </w:rPr>
       </w:pPr>
     </w:p>
@@ -441,7 +406,6 @@
         <w:jc w:val="center"/>
         <w:rPr>
           <w:szCs w:val="26"/>
-          <w:lang w:val="en-GB"/>
         </w:rPr>
       </w:pPr>
     </w:p>
@@ -455,13 +419,11 @@
         <w:jc w:val="center"/>
         <w:rPr>
           <w:szCs w:val="26"/>
-          <w:lang w:val="en-GB"/>
         </w:rPr>
       </w:pPr>
       <w:r>
         <w:rPr>
           <w:szCs w:val="26"/>
-          <w:lang w:val="en-GB"/>
         </w:rPr>
         <w:t>Approved upon application by</w:t>
       </w:r>
@@ -476,7 +438,6 @@
         <w:jc w:val="center"/>
         <w:rPr>
           <w:szCs w:val="26"/>
-          <w:lang w:val="en-GB"/>
         </w:rPr>
       </w:pPr>
     </w:p>
@@ -491,7 +452,6 @@
         <w:rPr>
           <w:b/>
           <w:szCs w:val="26"/>
-          <w:lang w:val="en-GB"/>
         </w:rPr>
       </w:pPr>
       <w:bookmarkStart w:id="0" w:name="OLE_LINK1"/>
@@ -499,7 +459,6 @@
         <w:rPr>
           <w:b/>
           <w:szCs w:val="26"/>
-          <w:lang w:val="en-GB"/>
         </w:rPr>
         <w:t>n</w:t>
       </w:r>
@@ -507,7 +466,6 @@
         <w:rPr>
           <w:b/>
           <w:szCs w:val="26"/>
-          <w:lang w:val="en-GB"/>
         </w:rPr>
         <w:t>ame</w:t>
       </w:r>
@@ -516,7 +474,6 @@
         <w:rPr>
           <w:b/>
           <w:szCs w:val="26"/>
-          <w:lang w:val="en-GB"/>
         </w:rPr>
         <w:t xml:space="preserve"> s</w:t>
       </w:r>
@@ -524,7 +481,6 @@
         <w:rPr>
           <w:b/>
           <w:szCs w:val="26"/>
-          <w:lang w:val="en-GB"/>
         </w:rPr>
         <w:t>urname</w:t>
       </w:r>
@@ -532,28 +488,24 @@
         <w:rPr>
           <w:b/>
           <w:szCs w:val="26"/>
-          <w:lang w:val="en-GB"/>
         </w:rPr>
         <w:t xml:space="preserve"> </w:t>
       </w:r>
       <w:r>
         <w:rPr>
           <w:szCs w:val="26"/>
-          <w:lang w:val="en-GB"/>
         </w:rPr>
         <w:t>(</w:t>
       </w:r>
       <w:r>
         <w:rPr>
           <w:szCs w:val="26"/>
-          <w:lang w:val="en-GB"/>
         </w:rPr>
         <w:t>supervisor</w:t>
       </w:r>
       <w:r>
         <w:rPr>
           <w:szCs w:val="26"/>
-          <w:lang w:val="en-GB"/>
         </w:rPr>
         <w:t>)</w:t>
       </w:r>
@@ -561,7 +513,6 @@
         <w:rPr>
           <w:b/>
           <w:szCs w:val="26"/>
-          <w:lang w:val="en-GB"/>
         </w:rPr>
         <w:t xml:space="preserve"> </w:t>
       </w:r>
@@ -577,7 +528,6 @@
         <w:rPr>
           <w:b/>
           <w:szCs w:val="26"/>
-          <w:lang w:val="en-GB"/>
         </w:rPr>
       </w:pPr>
     </w:p>
@@ -592,7 +542,6 @@
         <w:rPr>
           <w:b/>
           <w:szCs w:val="26"/>
-          <w:lang w:val="en-GB"/>
         </w:rPr>
       </w:pPr>
     </w:p>
@@ -607,7 +556,6 @@
         <w:rPr>
           <w:b/>
           <w:szCs w:val="26"/>
-          <w:lang w:val="en-GB"/>
         </w:rPr>
       </w:pPr>
     </w:p>
@@ -622,7 +570,6 @@
         <w:rPr>
           <w:b/>
           <w:szCs w:val="26"/>
-          <w:lang w:val="en-GB"/>
         </w:rPr>
       </w:pPr>
     </w:p>
@@ -636,37 +583,21 @@
         <w:jc w:val="center"/>
         <w:rPr>
           <w:szCs w:val="26"/>
-          <w:lang w:val="en-GB"/>
-        </w:rPr>
-      </w:pPr>
-      <w:r>
-        <w:rPr>
-          <w:lang w:val="en-GB"/>
-        </w:rPr>
+        </w:rPr>
+      </w:pPr>
+      <w:r>
         <w:t>p</w:t>
       </w:r>
       <w:r>
-        <w:rPr>
-          <w:lang w:val="en-GB"/>
-        </w:rPr>
         <w:t>lace</w:t>
       </w:r>
       <w:r>
-        <w:rPr>
-          <w:lang w:val="en-GB"/>
-        </w:rPr>
         <w:t xml:space="preserve"> / </w:t>
       </w:r>
       <w:r>
-        <w:rPr>
-          <w:lang w:val="en-GB"/>
-        </w:rPr>
         <w:t>d</w:t>
       </w:r>
       <w:r>
-        <w:rPr>
-          <w:lang w:val="en-GB"/>
-        </w:rPr>
         <w:t>ate</w:t>
       </w:r>
     </w:p>
@@ -678,9 +609,6 @@
         </w:rPr>
       </w:pPr>
       <w:r>
-        <w:rPr>
-          <w:lang w:val="en-GB"/>
-        </w:rPr>
         <w:br w:type="page"/>
       </w:r>
       <w:r>
@@ -695,12 +623,12 @@
     </w:p>
     <w:p>
       <w:pPr>
-        <w:pStyle w:val="BodyText"/>
-      </w:pPr>
-    </w:p>
-    <w:p>
-      <w:pPr>
-        <w:pStyle w:val="BodyText"/>
+        <w:pStyle w:val="Textkrper"/>
+      </w:pPr>
+    </w:p>
+    <w:p>
+      <w:pPr>
+        <w:pStyle w:val="Textkrper"/>
       </w:pPr>
     </w:p>
     <w:p>
@@ -721,7 +649,6 @@
           <w:b/>
           <w:sz w:val="34"/>
           <w:szCs w:val="34"/>
-          <w:lang w:val="en-GB"/>
         </w:rPr>
       </w:pPr>
       <w:r>
@@ -729,7 +656,6 @@
           <w:b/>
           <w:sz w:val="34"/>
           <w:szCs w:val="34"/>
-          <w:lang w:val="en-GB"/>
         </w:rPr>
         <w:lastRenderedPageBreak/>
         <w:t>Table of C</w:t>
@@ -739,7 +665,6 @@
           <w:b/>
           <w:sz w:val="34"/>
           <w:szCs w:val="34"/>
-          <w:lang w:val="en-GB"/>
         </w:rPr>
         <w:t>ontent</w:t>
       </w:r>
@@ -748,14 +673,13 @@
           <w:b/>
           <w:sz w:val="34"/>
           <w:szCs w:val="34"/>
-          <w:lang w:val="en-GB"/>
         </w:rPr>
         <w:t>s</w:t>
       </w:r>
     </w:p>
     <w:p>
       <w:pPr>
-        <w:pStyle w:val="TOC1"/>
+        <w:pStyle w:val="Verzeichnis1"/>
         <w:rPr>
           <w:rFonts w:asciiTheme="minorHAnsi" w:eastAsiaTheme="minorEastAsia" w:hAnsiTheme="minorHAnsi" w:cstheme="minorBidi"/>
           <w:color w:val="auto"/>
@@ -764,28 +688,18 @@
         </w:rPr>
       </w:pPr>
       <w:r>
-        <w:rPr>
-          <w:lang w:val="en-GB"/>
-        </w:rPr>
         <w:fldChar w:fldCharType="begin"/>
       </w:r>
       <w:r>
-        <w:rPr>
-          <w:lang w:val="en-GB"/>
-        </w:rPr>
         <w:instrText xml:space="preserve"> TOC \o "1-4" \h \z \u </w:instrText>
       </w:r>
       <w:r>
-        <w:rPr>
-          <w:lang w:val="en-GB"/>
-        </w:rPr>
         <w:fldChar w:fldCharType="separate"/>
       </w:r>
       <w:hyperlink w:anchor="_Toc20688605" w:history="1">
         <w:r>
           <w:rPr>
             <w:rStyle w:val="Hyperlink"/>
-            <w:lang w:val="en-GB"/>
           </w:rPr>
           <w:t>1</w:t>
         </w:r>
@@ -801,7 +715,6 @@
         <w:r>
           <w:rPr>
             <w:rStyle w:val="Hyperlink"/>
-            <w:lang w:val="en-GB"/>
           </w:rPr>
           <w:t>Introduction</w:t>
         </w:r>
@@ -850,7 +763,7 @@
     </w:p>
     <w:p>
       <w:pPr>
-        <w:pStyle w:val="TOC1"/>
+        <w:pStyle w:val="Verzeichnis1"/>
         <w:rPr>
           <w:rFonts w:asciiTheme="minorHAnsi" w:eastAsiaTheme="minorEastAsia" w:hAnsiTheme="minorHAnsi" w:cstheme="minorBidi"/>
           <w:color w:val="auto"/>
@@ -862,7 +775,6 @@
         <w:r>
           <w:rPr>
             <w:rStyle w:val="Hyperlink"/>
-            <w:lang w:val="en-GB"/>
           </w:rPr>
           <w:t>2</w:t>
         </w:r>
@@ -878,7 +790,6 @@
         <w:r>
           <w:rPr>
             <w:rStyle w:val="Hyperlink"/>
-            <w:lang w:val="en-GB"/>
           </w:rPr>
           <w:t>Body text / Review of Literature</w:t>
         </w:r>
@@ -927,7 +838,7 @@
     </w:p>
     <w:p>
       <w:pPr>
-        <w:pStyle w:val="TOC1"/>
+        <w:pStyle w:val="Verzeichnis1"/>
         <w:rPr>
           <w:rFonts w:asciiTheme="minorHAnsi" w:eastAsiaTheme="minorEastAsia" w:hAnsiTheme="minorHAnsi" w:cstheme="minorBidi"/>
           <w:color w:val="auto"/>
@@ -939,7 +850,6 @@
         <w:r>
           <w:rPr>
             <w:rStyle w:val="Hyperlink"/>
-            <w:lang w:val="en-GB"/>
           </w:rPr>
           <w:t>3</w:t>
         </w:r>
@@ -955,7 +865,6 @@
         <w:r>
           <w:rPr>
             <w:rStyle w:val="Hyperlink"/>
-            <w:lang w:val="en-GB"/>
           </w:rPr>
           <w:t>Discussion</w:t>
         </w:r>
@@ -1004,7 +913,7 @@
     </w:p>
     <w:p>
       <w:pPr>
-        <w:pStyle w:val="TOC1"/>
+        <w:pStyle w:val="Verzeichnis1"/>
         <w:rPr>
           <w:rFonts w:asciiTheme="minorHAnsi" w:eastAsiaTheme="minorEastAsia" w:hAnsiTheme="minorHAnsi" w:cstheme="minorBidi"/>
           <w:color w:val="auto"/>
@@ -1016,7 +925,6 @@
         <w:r>
           <w:rPr>
             <w:rStyle w:val="Hyperlink"/>
-            <w:lang w:val="en-GB"/>
           </w:rPr>
           <w:t>4</w:t>
         </w:r>
@@ -1032,7 +940,6 @@
         <w:r>
           <w:rPr>
             <w:rStyle w:val="Hyperlink"/>
-            <w:lang w:val="en-GB"/>
           </w:rPr>
           <w:t>Conclusion</w:t>
         </w:r>
@@ -1081,7 +988,7 @@
     </w:p>
     <w:p>
       <w:pPr>
-        <w:pStyle w:val="TOC1"/>
+        <w:pStyle w:val="Verzeichnis1"/>
         <w:rPr>
           <w:rFonts w:asciiTheme="minorHAnsi" w:eastAsiaTheme="minorEastAsia" w:hAnsiTheme="minorHAnsi" w:cstheme="minorBidi"/>
           <w:color w:val="auto"/>
@@ -1093,7 +1000,6 @@
         <w:r>
           <w:rPr>
             <w:rStyle w:val="Hyperlink"/>
-            <w:lang w:val="en-GB"/>
           </w:rPr>
           <w:t>5</w:t>
         </w:r>
@@ -1109,7 +1015,6 @@
         <w:r>
           <w:rPr>
             <w:rStyle w:val="Hyperlink"/>
-            <w:lang w:val="en-GB"/>
           </w:rPr>
           <w:t>Bibliography</w:t>
         </w:r>
@@ -1158,7 +1063,7 @@
     </w:p>
     <w:p>
       <w:pPr>
-        <w:pStyle w:val="TOC1"/>
+        <w:pStyle w:val="Verzeichnis1"/>
         <w:rPr>
           <w:rFonts w:asciiTheme="minorHAnsi" w:eastAsiaTheme="minorEastAsia" w:hAnsiTheme="minorHAnsi" w:cstheme="minorBidi"/>
           <w:color w:val="auto"/>
@@ -1170,7 +1075,6 @@
         <w:r>
           <w:rPr>
             <w:rStyle w:val="Hyperlink"/>
-            <w:lang w:val="en-GB"/>
           </w:rPr>
           <w:t>6</w:t>
         </w:r>
@@ -1186,7 +1090,6 @@
         <w:r>
           <w:rPr>
             <w:rStyle w:val="Hyperlink"/>
-            <w:lang w:val="en-GB"/>
           </w:rPr>
           <w:t>Table of Figures</w:t>
         </w:r>
@@ -1235,7 +1138,7 @@
     </w:p>
     <w:p>
       <w:pPr>
-        <w:pStyle w:val="TOC1"/>
+        <w:pStyle w:val="Verzeichnis1"/>
         <w:rPr>
           <w:rFonts w:asciiTheme="minorHAnsi" w:eastAsiaTheme="minorEastAsia" w:hAnsiTheme="minorHAnsi" w:cstheme="minorBidi"/>
           <w:color w:val="auto"/>
@@ -1247,7 +1150,6 @@
         <w:r>
           <w:rPr>
             <w:rStyle w:val="Hyperlink"/>
-            <w:lang w:val="en-GB"/>
           </w:rPr>
           <w:t>7</w:t>
         </w:r>
@@ -1263,7 +1165,6 @@
         <w:r>
           <w:rPr>
             <w:rStyle w:val="Hyperlink"/>
-            <w:lang w:val="en-GB"/>
           </w:rPr>
           <w:t>Declaration of academic integrity</w:t>
         </w:r>
@@ -1316,13 +1217,9 @@
           <w:b/>
           <w:sz w:val="34"/>
           <w:szCs w:val="34"/>
-          <w:lang w:val="en-GB"/>
-        </w:rPr>
-      </w:pPr>
-      <w:r>
-        <w:rPr>
-          <w:lang w:val="en-GB"/>
-        </w:rPr>
+        </w:rPr>
+      </w:pPr>
+      <w:r>
         <w:fldChar w:fldCharType="end"/>
       </w:r>
       <w:r>
@@ -1330,16 +1227,12 @@
           <w:b/>
           <w:sz w:val="34"/>
           <w:szCs w:val="34"/>
-          <w:lang w:val="en-GB"/>
         </w:rPr>
         <w:br w:type="page"/>
       </w:r>
     </w:p>
     <w:p>
       <w:pPr>
-        <w:rPr>
-          <w:lang w:val="en-GB"/>
-        </w:rPr>
         <w:sectPr>
           <w:headerReference w:type="even" r:id="rId10"/>
           <w:headerReference w:type="default" r:id="rId11"/>
@@ -1353,16 +1246,10 @@
     </w:p>
     <w:p>
       <w:pPr>
-        <w:pStyle w:val="Heading1"/>
-        <w:rPr>
-          <w:lang w:val="en-GB"/>
-        </w:rPr>
+        <w:pStyle w:val="berschrift1"/>
       </w:pPr>
       <w:bookmarkStart w:id="1" w:name="_Toc20688605"/>
       <w:r>
-        <w:rPr>
-          <w:lang w:val="en-GB"/>
-        </w:rPr>
         <w:lastRenderedPageBreak/>
         <w:t>Introduction</w:t>
       </w:r>
@@ -1370,191 +1257,161 @@
     </w:p>
     <w:p>
       <w:pPr>
-        <w:pStyle w:val="BodyText"/>
-        <w:rPr>
-          <w:lang w:val="en-GB" w:eastAsia="de-DE"/>
-        </w:rPr>
-      </w:pPr>
-      <w:r>
-        <w:rPr>
-          <w:lang w:val="en-GB" w:eastAsia="de-DE"/>
+        <w:pStyle w:val="Textkrper"/>
+        <w:rPr>
+          <w:lang w:eastAsia="de-DE"/>
+        </w:rPr>
+      </w:pPr>
+      <w:r>
+        <w:rPr>
+          <w:lang w:eastAsia="de-DE"/>
         </w:rPr>
         <w:t>(Use paragraph style “</w:t>
       </w:r>
       <w:proofErr w:type="spellStart"/>
       <w:r>
         <w:rPr>
-          <w:lang w:val="en-GB" w:eastAsia="de-DE"/>
+          <w:lang w:eastAsia="de-DE"/>
         </w:rPr>
         <w:t>Textkörper</w:t>
       </w:r>
       <w:proofErr w:type="spellEnd"/>
       <w:r>
         <w:rPr>
-          <w:lang w:val="en-GB" w:eastAsia="de-DE"/>
+          <w:lang w:eastAsia="de-DE"/>
         </w:rPr>
         <w:t>” for justification. Use paragraph style “</w:t>
       </w:r>
       <w:proofErr w:type="spellStart"/>
       <w:r>
         <w:rPr>
-          <w:lang w:val="en-GB" w:eastAsia="de-DE"/>
+          <w:lang w:eastAsia="de-DE"/>
         </w:rPr>
         <w:t>Textkörper</w:t>
       </w:r>
       <w:proofErr w:type="spellEnd"/>
       <w:r>
         <w:rPr>
-          <w:lang w:val="en-GB" w:eastAsia="de-DE"/>
+          <w:lang w:eastAsia="de-DE"/>
         </w:rPr>
         <w:t>” for justification. Use paragraph style “</w:t>
       </w:r>
       <w:proofErr w:type="spellStart"/>
       <w:r>
         <w:rPr>
-          <w:lang w:val="en-GB" w:eastAsia="de-DE"/>
+          <w:lang w:eastAsia="de-DE"/>
         </w:rPr>
         <w:t>Textkörper</w:t>
       </w:r>
       <w:proofErr w:type="spellEnd"/>
       <w:r>
         <w:rPr>
-          <w:lang w:val="en-GB" w:eastAsia="de-DE"/>
+          <w:lang w:eastAsia="de-DE"/>
         </w:rPr>
         <w:t>” for justification.</w:t>
       </w:r>
       <w:r>
         <w:rPr>
-          <w:lang w:val="en-GB" w:eastAsia="de-DE"/>
+          <w:lang w:eastAsia="de-DE"/>
         </w:rPr>
         <w:t xml:space="preserve"> </w:t>
       </w:r>
       <w:r>
         <w:rPr>
-          <w:lang w:val="en-GB" w:eastAsia="de-DE"/>
+          <w:lang w:eastAsia="de-DE"/>
         </w:rPr>
         <w:t>Use paragraph style “</w:t>
       </w:r>
       <w:proofErr w:type="spellStart"/>
       <w:r>
         <w:rPr>
-          <w:lang w:val="en-GB" w:eastAsia="de-DE"/>
+          <w:lang w:eastAsia="de-DE"/>
         </w:rPr>
         <w:t>Textkörper</w:t>
       </w:r>
       <w:proofErr w:type="spellEnd"/>
       <w:r>
         <w:rPr>
-          <w:lang w:val="en-GB" w:eastAsia="de-DE"/>
+          <w:lang w:eastAsia="de-DE"/>
         </w:rPr>
         <w:t>” for justification.)</w:t>
       </w:r>
     </w:p>
     <w:p>
       <w:pPr>
-        <w:pStyle w:val="Heading1"/>
-        <w:rPr>
-          <w:lang w:val="en-GB"/>
-        </w:rPr>
+        <w:pStyle w:val="berschrift1"/>
       </w:pPr>
       <w:bookmarkStart w:id="2" w:name="_Toc20688606"/>
       <w:r>
-        <w:rPr>
-          <w:lang w:val="en-GB"/>
-        </w:rPr>
         <w:t>Body text</w:t>
       </w:r>
       <w:r>
-        <w:rPr>
-          <w:lang w:val="en-GB"/>
-        </w:rPr>
         <w:t xml:space="preserve"> / Review of Literature</w:t>
       </w:r>
       <w:bookmarkEnd w:id="2"/>
     </w:p>
     <w:p>
       <w:pPr>
-        <w:pStyle w:val="BodyText"/>
-        <w:rPr>
-          <w:lang w:val="en-GB" w:eastAsia="de-DE"/>
-        </w:rPr>
-      </w:pPr>
-      <w:r>
-        <w:rPr>
-          <w:lang w:val="en-GB" w:eastAsia="de-DE"/>
+        <w:pStyle w:val="Textkrper"/>
+        <w:rPr>
+          <w:lang w:eastAsia="de-DE"/>
+        </w:rPr>
+      </w:pPr>
+      <w:r>
+        <w:rPr>
+          <w:lang w:eastAsia="de-DE"/>
         </w:rPr>
         <w:t>a</w:t>
       </w:r>
     </w:p>
     <w:p>
       <w:pPr>
-        <w:pStyle w:val="Heading1"/>
-        <w:rPr>
-          <w:lang w:val="en-GB"/>
-        </w:rPr>
+        <w:pStyle w:val="berschrift1"/>
       </w:pPr>
       <w:bookmarkStart w:id="3" w:name="_Toc20688607"/>
       <w:r>
-        <w:rPr>
-          <w:lang w:val="en-GB"/>
-        </w:rPr>
         <w:t>Discussion</w:t>
       </w:r>
       <w:bookmarkEnd w:id="3"/>
     </w:p>
     <w:p>
       <w:pPr>
-        <w:pStyle w:val="BodyText"/>
-      </w:pPr>
-    </w:p>
-    <w:p>
-      <w:pPr>
-        <w:pStyle w:val="Heading1"/>
-        <w:rPr>
-          <w:lang w:val="en-GB"/>
-        </w:rPr>
+        <w:pStyle w:val="Textkrper"/>
+      </w:pPr>
+    </w:p>
+    <w:p>
+      <w:pPr>
+        <w:pStyle w:val="berschrift1"/>
       </w:pPr>
       <w:bookmarkStart w:id="4" w:name="_Toc20688608"/>
       <w:r>
-        <w:rPr>
-          <w:lang w:val="en-GB"/>
-        </w:rPr>
         <w:t>Conclusion</w:t>
       </w:r>
       <w:bookmarkEnd w:id="4"/>
     </w:p>
     <w:p>
       <w:pPr>
-        <w:pStyle w:val="BodyText"/>
-        <w:rPr>
-          <w:lang w:val="en-GB" w:eastAsia="de-DE"/>
-        </w:rPr>
-      </w:pPr>
-      <w:r>
-        <w:rPr>
-          <w:lang w:val="en-GB" w:eastAsia="de-DE"/>
+        <w:pStyle w:val="Textkrper"/>
+        <w:rPr>
+          <w:lang w:eastAsia="de-DE"/>
+        </w:rPr>
+      </w:pPr>
+      <w:r>
+        <w:rPr>
+          <w:lang w:eastAsia="de-DE"/>
         </w:rPr>
         <w:t>a</w:t>
       </w:r>
     </w:p>
     <w:p>
       <w:pPr>
-        <w:pStyle w:val="Heading1"/>
-        <w:rPr>
-          <w:lang w:val="en-GB"/>
-        </w:rPr>
-      </w:pPr>
-      <w:r>
-        <w:rPr>
-          <w:lang w:val="en-GB"/>
-        </w:rPr>
+        <w:pStyle w:val="berschrift1"/>
+      </w:pPr>
+      <w:r>
         <w:br w:type="page"/>
       </w:r>
       <w:bookmarkStart w:id="5" w:name="_Toc20688609"/>
       <w:r>
-        <w:rPr>
-          <w:lang w:val="en-GB"/>
-        </w:rPr>
         <w:lastRenderedPageBreak/>
         <w:t>Bibliography</w:t>
       </w:r>
@@ -1563,12 +1420,12 @@
     <w:p>
       <w:pPr>
         <w:rPr>
-          <w:lang w:val="en-GB" w:eastAsia="de-DE"/>
-        </w:rPr>
-      </w:pPr>
-      <w:r>
-        <w:rPr>
-          <w:lang w:val="en-GB" w:eastAsia="de-DE"/>
+          <w:lang w:eastAsia="de-DE"/>
+        </w:rPr>
+      </w:pPr>
+      <w:r>
+        <w:rPr>
+          <w:lang w:eastAsia="de-DE"/>
         </w:rPr>
         <w:t>a</w:t>
       </w:r>
@@ -1577,28 +1434,22 @@
       <w:pPr>
         <w:spacing w:after="0" w:line="240" w:lineRule="auto"/>
         <w:rPr>
-          <w:lang w:val="en-GB" w:eastAsia="de-DE"/>
-        </w:rPr>
-      </w:pPr>
-      <w:r>
-        <w:rPr>
-          <w:lang w:val="en-GB" w:eastAsia="de-DE"/>
+          <w:lang w:eastAsia="de-DE"/>
+        </w:rPr>
+      </w:pPr>
+      <w:r>
+        <w:rPr>
+          <w:lang w:eastAsia="de-DE"/>
         </w:rPr>
         <w:br w:type="page"/>
       </w:r>
     </w:p>
     <w:p>
       <w:pPr>
-        <w:pStyle w:val="Heading1"/>
-        <w:rPr>
-          <w:lang w:val="en-GB"/>
-        </w:rPr>
+        <w:pStyle w:val="berschrift1"/>
       </w:pPr>
       <w:bookmarkStart w:id="6" w:name="_Toc20688610"/>
       <w:r>
-        <w:rPr>
-          <w:lang w:val="en-GB"/>
-        </w:rPr>
         <w:lastRenderedPageBreak/>
         <w:t>Table of Figures</w:t>
       </w:r>
@@ -1607,34 +1458,25 @@
     <w:p>
       <w:pPr>
         <w:rPr>
-          <w:lang w:val="en-GB" w:eastAsia="de-DE"/>
-        </w:rPr>
-      </w:pPr>
-      <w:r>
-        <w:rPr>
-          <w:lang w:val="en-GB" w:eastAsia="de-DE"/>
+          <w:lang w:eastAsia="de-DE"/>
+        </w:rPr>
+      </w:pPr>
+      <w:r>
+        <w:rPr>
+          <w:lang w:eastAsia="de-DE"/>
         </w:rPr>
         <w:t>a</w:t>
       </w:r>
     </w:p>
     <w:p>
       <w:pPr>
-        <w:pStyle w:val="Heading1"/>
-        <w:rPr>
-          <w:lang w:val="en-GB"/>
-        </w:rPr>
-      </w:pPr>
-      <w:r>
-        <w:rPr>
-          <w:lang w:val="en-GB"/>
-        </w:rPr>
+        <w:pStyle w:val="berschrift1"/>
+      </w:pPr>
+      <w:r>
         <w:br w:type="page"/>
       </w:r>
       <w:bookmarkStart w:id="7" w:name="_Toc20688611"/>
       <w:r>
-        <w:rPr>
-          <w:lang w:val="en-GB"/>
-        </w:rPr>
         <w:lastRenderedPageBreak/>
         <w:t>Declaration of academic integrity</w:t>
       </w:r>
@@ -1643,19 +1485,19 @@
     <w:p>
       <w:pPr>
         <w:rPr>
-          <w:lang w:val="en-GB" w:eastAsia="de-DE"/>
-        </w:rPr>
-      </w:pPr>
-      <w:r>
-        <w:rPr>
-          <w:lang w:val="en-GB" w:eastAsia="de-DE"/>
+          <w:lang w:eastAsia="de-DE"/>
+        </w:rPr>
+      </w:pPr>
+      <w:r>
+        <w:rPr>
+          <w:lang w:eastAsia="de-DE"/>
         </w:rPr>
         <w:t xml:space="preserve">I hereby confirm that the present paper </w:t>
       </w:r>
       <w:r>
         <w:rPr>
           <w:i/>
-          <w:lang w:val="en-GB" w:eastAsia="de-DE"/>
+          <w:lang w:eastAsia="de-DE"/>
         </w:rPr>
         <w:t>(title)</w:t>
       </w:r>
@@ -1663,24 +1505,24 @@
     <w:p>
       <w:pPr>
         <w:rPr>
-          <w:lang w:val="en-GB" w:eastAsia="de-DE"/>
-        </w:rPr>
-      </w:pPr>
-      <w:r>
-        <w:rPr>
-          <w:lang w:val="en-GB" w:eastAsia="de-DE"/>
+          <w:lang w:eastAsia="de-DE"/>
+        </w:rPr>
+      </w:pPr>
+      <w:r>
+        <w:rPr>
+          <w:lang w:eastAsia="de-DE"/>
         </w:rPr>
         <w:t xml:space="preserve">is the result of my own independent scholarly work, and </w:t>
       </w:r>
       <w:r>
         <w:rPr>
-          <w:lang w:val="en-GB" w:eastAsia="de-DE"/>
+          <w:lang w:eastAsia="de-DE"/>
         </w:rPr>
         <w:t>in all cases,</w:t>
       </w:r>
       <w:r>
         <w:rPr>
-          <w:lang w:val="en-GB" w:eastAsia="de-DE"/>
+          <w:lang w:eastAsia="de-DE"/>
         </w:rPr>
         <w:t xml:space="preserve"> material from the work of others (in books, articles, essays, dissertations, and on the internet) is acknowledged, and quotations and paraphrases are clearly indicated. No material other than that listed has been used. </w:t>
       </w:r>
@@ -1688,79 +1530,79 @@
     <w:p>
       <w:pPr>
         <w:rPr>
-          <w:lang w:val="en-GB" w:eastAsia="de-DE"/>
-        </w:rPr>
-      </w:pPr>
-    </w:p>
-    <w:p>
-      <w:pPr>
-        <w:rPr>
-          <w:lang w:val="en-GB" w:eastAsia="de-DE"/>
-        </w:rPr>
-      </w:pPr>
-      <w:r>
-        <w:rPr>
-          <w:lang w:val="en-GB" w:eastAsia="de-DE"/>
+          <w:lang w:eastAsia="de-DE"/>
+        </w:rPr>
+      </w:pPr>
+    </w:p>
+    <w:p>
+      <w:pPr>
+        <w:rPr>
+          <w:lang w:eastAsia="de-DE"/>
+        </w:rPr>
+      </w:pPr>
+      <w:r>
+        <w:rPr>
+          <w:lang w:eastAsia="de-DE"/>
         </w:rPr>
         <w:t>Place</w:t>
       </w:r>
       <w:r>
         <w:rPr>
-          <w:lang w:val="en-GB" w:eastAsia="de-DE"/>
+          <w:lang w:eastAsia="de-DE"/>
         </w:rPr>
         <w:t xml:space="preserve"> / d</w:t>
       </w:r>
       <w:r>
         <w:rPr>
-          <w:lang w:val="en-GB" w:eastAsia="de-DE"/>
+          <w:lang w:eastAsia="de-DE"/>
         </w:rPr>
         <w:t>ate</w:t>
       </w:r>
       <w:r>
         <w:rPr>
-          <w:lang w:val="en-GB" w:eastAsia="de-DE"/>
+          <w:lang w:eastAsia="de-DE"/>
         </w:rPr>
         <w:tab/>
       </w:r>
       <w:r>
         <w:rPr>
-          <w:lang w:val="en-GB" w:eastAsia="de-DE"/>
+          <w:lang w:eastAsia="de-DE"/>
         </w:rPr>
         <w:tab/>
       </w:r>
       <w:r>
         <w:rPr>
-          <w:lang w:val="en-GB" w:eastAsia="de-DE"/>
+          <w:lang w:eastAsia="de-DE"/>
         </w:rPr>
         <w:tab/>
       </w:r>
       <w:r>
         <w:rPr>
-          <w:lang w:val="en-GB" w:eastAsia="de-DE"/>
+          <w:lang w:eastAsia="de-DE"/>
         </w:rPr>
         <w:tab/>
       </w:r>
       <w:r>
         <w:rPr>
-          <w:lang w:val="en-GB" w:eastAsia="de-DE"/>
+          <w:lang w:eastAsia="de-DE"/>
         </w:rPr>
         <w:tab/>
       </w:r>
       <w:r>
         <w:rPr>
-          <w:lang w:val="en-GB" w:eastAsia="de-DE"/>
+          <w:lang w:eastAsia="de-DE"/>
         </w:rPr>
         <w:tab/>
       </w:r>
       <w:r>
         <w:rPr>
-          <w:lang w:val="en-GB" w:eastAsia="de-DE"/>
+          <w:lang w:eastAsia="de-DE"/>
         </w:rPr>
         <w:t>Signature</w:t>
       </w:r>
       <w:r>
         <w:rPr>
-          <w:lang w:val="en-GB" w:eastAsia="de-DE"/>
+          <w:lang w:eastAsia="de-DE"/>
         </w:rPr>
         <w:t xml:space="preserve">: </w:t>
       </w:r>
@@ -1809,7 +1651,7 @@
 <w:ftr xmlns:wpc="http://schemas.microsoft.com/office/word/2010/wordprocessingCanvas" xmlns:cx="http://schemas.microsoft.com/office/drawing/2014/chartex" xmlns:cx1="http://schemas.microsoft.com/office/drawing/2015/9/8/chartex" xmlns:cx2="http://schemas.microsoft.com/office/drawing/2015/10/21/chartex" xmlns:cx3="http://schemas.microsoft.com/office/drawing/2016/5/9/chartex" xmlns:cx4="http://schemas.microsoft.com/office/drawing/2016/5/10/chartex" xmlns:cx5="http://schemas.microsoft.com/office/drawing/2016/5/11/chartex" xmlns:cx6="http://schemas.microsoft.com/office/drawing/2016/5/12/chartex" xmlns:cx7="http://schemas.microsoft.com/office/drawing/2016/5/13/chartex" xmlns:cx8="http://schemas.microsoft.com/office/drawing/2016/5/14/chartex" xmlns:mc="http://schemas.openxmlformats.org/markup-compatibility/2006" xmlns:aink="http://schemas.microsoft.com/office/drawing/2016/ink" xmlns:am3d="http://schemas.microsoft.com/office/drawing/2017/model3d" xmlns:o="urn:schemas-microsoft-com:office:office" xmlns:oel="http://schemas.microsoft.com/office/2019/extlst" xmlns:r="http://schemas.openxmlformats.org/officeDocument/2006/relationships" xmlns:m="http://schemas.openxmlformats.org/officeDocument/2006/math" xmlns:v="urn:schemas-microsoft-com:vml" xmlns:wp14="http://schemas.microsoft.com/office/word/2010/wordprocessingDrawing" xmlns:wp="http://schemas.openxmlformats.org/drawingml/2006/wordprocessingDrawing" xmlns:w10="urn:schemas-microsoft-com:office:word" xmlns:w="http://schemas.openxmlformats.org/wordprocessingml/2006/main" xmlns:w14="http://schemas.microsoft.com/office/word/2010/wordml" xmlns:w15="http://schemas.microsoft.com/office/word/2012/wordml" xmlns:w16cex="http://schemas.microsoft.com/office/word/2018/wordml/cex" xmlns:w16cid="http://schemas.microsoft.com/office/word/2016/wordml/cid" xmlns:w16="http://schemas.microsoft.com/office/word/2018/wordml" xmlns:w16du="http://schemas.microsoft.com/office/word/2023/wordml/word16du" xmlns:w16sdtdh="http://schemas.microsoft.com/office/word/2020/wordml/sdtdatahash" xmlns:w16sdtfl="http://schemas.microsoft.com/office/word/2024/wordml/sdtformatlock" xmlns:w16se="http://schemas.microsoft.com/office/word/2015/wordml/symex" xmlns:wpg="http://schemas.microsoft.com/office/word/2010/wordprocessingGroup" xmlns:wpi="http://schemas.microsoft.com/office/word/2010/wordprocessingInk" xmlns:wne="http://schemas.microsoft.com/office/word/2006/wordml" xmlns:wps="http://schemas.microsoft.com/office/word/2010/wordprocessingShape" mc:Ignorable="w14 w15 w16se w16cid w16 w16cex w16sdtdh w16sdtfl w16du wp14">
   <w:p>
     <w:pPr>
-      <w:pStyle w:val="Footer"/>
+      <w:pStyle w:val="Fuzeile"/>
     </w:pPr>
   </w:p>
 </w:ftr>
@@ -1819,7 +1661,7 @@
 <w:ftr xmlns:wpc="http://schemas.microsoft.com/office/word/2010/wordprocessingCanvas" xmlns:cx="http://schemas.microsoft.com/office/drawing/2014/chartex" xmlns:cx1="http://schemas.microsoft.com/office/drawing/2015/9/8/chartex" xmlns:cx2="http://schemas.microsoft.com/office/drawing/2015/10/21/chartex" xmlns:cx3="http://schemas.microsoft.com/office/drawing/2016/5/9/chartex" xmlns:cx4="http://schemas.microsoft.com/office/drawing/2016/5/10/chartex" xmlns:cx5="http://schemas.microsoft.com/office/drawing/2016/5/11/chartex" xmlns:cx6="http://schemas.microsoft.com/office/drawing/2016/5/12/chartex" xmlns:cx7="http://schemas.microsoft.com/office/drawing/2016/5/13/chartex" xmlns:cx8="http://schemas.microsoft.com/office/drawing/2016/5/14/chartex" xmlns:mc="http://schemas.openxmlformats.org/markup-compatibility/2006" xmlns:aink="http://schemas.microsoft.com/office/drawing/2016/ink" xmlns:am3d="http://schemas.microsoft.com/office/drawing/2017/model3d" xmlns:o="urn:schemas-microsoft-com:office:office" xmlns:oel="http://schemas.microsoft.com/office/2019/extlst" xmlns:r="http://schemas.openxmlformats.org/officeDocument/2006/relationships" xmlns:m="http://schemas.openxmlformats.org/officeDocument/2006/math" xmlns:v="urn:schemas-microsoft-com:vml" xmlns:wp14="http://schemas.microsoft.com/office/word/2010/wordprocessingDrawing" xmlns:wp="http://schemas.openxmlformats.org/drawingml/2006/wordprocessingDrawing" xmlns:w10="urn:schemas-microsoft-com:office:word" xmlns:w="http://schemas.openxmlformats.org/wordprocessingml/2006/main" xmlns:w14="http://schemas.microsoft.com/office/word/2010/wordml" xmlns:w15="http://schemas.microsoft.com/office/word/2012/wordml" xmlns:w16cex="http://schemas.microsoft.com/office/word/2018/wordml/cex" xmlns:w16cid="http://schemas.microsoft.com/office/word/2016/wordml/cid" xmlns:w16="http://schemas.microsoft.com/office/word/2018/wordml" xmlns:w16du="http://schemas.microsoft.com/office/word/2023/wordml/word16du" xmlns:w16sdtdh="http://schemas.microsoft.com/office/word/2020/wordml/sdtdatahash" xmlns:w16sdtfl="http://schemas.microsoft.com/office/word/2024/wordml/sdtformatlock" xmlns:w16se="http://schemas.microsoft.com/office/word/2015/wordml/symex" xmlns:wpg="http://schemas.microsoft.com/office/word/2010/wordprocessingGroup" xmlns:wpi="http://schemas.microsoft.com/office/word/2010/wordprocessingInk" xmlns:wne="http://schemas.microsoft.com/office/word/2006/wordml" xmlns:wps="http://schemas.microsoft.com/office/word/2010/wordprocessingShape" mc:Ignorable="w14 w15 w16se w16cid w16 w16cex w16sdtdh w16sdtfl w16du wp14">
   <w:p>
     <w:pPr>
-      <w:pStyle w:val="Footer"/>
+      <w:pStyle w:val="Fuzeile"/>
     </w:pPr>
     <w:r>
       <w:t>Interdisziplinäre Arbeit (IDA) at GKD</w:t>
@@ -1839,7 +1681,7 @@
 <w:ftr xmlns:wpc="http://schemas.microsoft.com/office/word/2010/wordprocessingCanvas" xmlns:cx="http://schemas.microsoft.com/office/drawing/2014/chartex" xmlns:cx1="http://schemas.microsoft.com/office/drawing/2015/9/8/chartex" xmlns:cx2="http://schemas.microsoft.com/office/drawing/2015/10/21/chartex" xmlns:cx3="http://schemas.microsoft.com/office/drawing/2016/5/9/chartex" xmlns:cx4="http://schemas.microsoft.com/office/drawing/2016/5/10/chartex" xmlns:cx5="http://schemas.microsoft.com/office/drawing/2016/5/11/chartex" xmlns:cx6="http://schemas.microsoft.com/office/drawing/2016/5/12/chartex" xmlns:cx7="http://schemas.microsoft.com/office/drawing/2016/5/13/chartex" xmlns:cx8="http://schemas.microsoft.com/office/drawing/2016/5/14/chartex" xmlns:mc="http://schemas.openxmlformats.org/markup-compatibility/2006" xmlns:aink="http://schemas.microsoft.com/office/drawing/2016/ink" xmlns:am3d="http://schemas.microsoft.com/office/drawing/2017/model3d" xmlns:o="urn:schemas-microsoft-com:office:office" xmlns:oel="http://schemas.microsoft.com/office/2019/extlst" xmlns:r="http://schemas.openxmlformats.org/officeDocument/2006/relationships" xmlns:m="http://schemas.openxmlformats.org/officeDocument/2006/math" xmlns:v="urn:schemas-microsoft-com:vml" xmlns:wp14="http://schemas.microsoft.com/office/word/2010/wordprocessingDrawing" xmlns:wp="http://schemas.openxmlformats.org/drawingml/2006/wordprocessingDrawing" xmlns:w10="urn:schemas-microsoft-com:office:word" xmlns:w="http://schemas.openxmlformats.org/wordprocessingml/2006/main" xmlns:w14="http://schemas.microsoft.com/office/word/2010/wordml" xmlns:w15="http://schemas.microsoft.com/office/word/2012/wordml" xmlns:w16cex="http://schemas.microsoft.com/office/word/2018/wordml/cex" xmlns:w16cid="http://schemas.microsoft.com/office/word/2016/wordml/cid" xmlns:w16="http://schemas.microsoft.com/office/word/2018/wordml" xmlns:w16du="http://schemas.microsoft.com/office/word/2023/wordml/word16du" xmlns:w16sdtdh="http://schemas.microsoft.com/office/word/2020/wordml/sdtdatahash" xmlns:w16sdtfl="http://schemas.microsoft.com/office/word/2024/wordml/sdtformatlock" xmlns:w16se="http://schemas.microsoft.com/office/word/2015/wordml/symex" xmlns:wpg="http://schemas.microsoft.com/office/word/2010/wordprocessingGroup" xmlns:wpi="http://schemas.microsoft.com/office/word/2010/wordprocessingInk" xmlns:wne="http://schemas.microsoft.com/office/word/2006/wordml" xmlns:wps="http://schemas.microsoft.com/office/word/2010/wordprocessingShape" mc:Ignorable="w14 w15 w16se w16cid w16 w16cex w16sdtdh w16sdtfl w16du wp14">
   <w:p>
     <w:pPr>
-      <w:pStyle w:val="Footer"/>
+      <w:pStyle w:val="Fuzeile"/>
     </w:pPr>
     <w:r>
       <w:t xml:space="preserve">Interdisziplinäre Arbeit (IDA) </w:t>
@@ -1901,7 +1743,7 @@
 <w:hdr xmlns:wpc="http://schemas.microsoft.com/office/word/2010/wordprocessingCanvas" xmlns:cx="http://schemas.microsoft.com/office/drawing/2014/chartex" xmlns:cx1="http://schemas.microsoft.com/office/drawing/2015/9/8/chartex" xmlns:cx2="http://schemas.microsoft.com/office/drawing/2015/10/21/chartex" xmlns:cx3="http://schemas.microsoft.com/office/drawing/2016/5/9/chartex" xmlns:cx4="http://schemas.microsoft.com/office/drawing/2016/5/10/chartex" xmlns:cx5="http://schemas.microsoft.com/office/drawing/2016/5/11/chartex" xmlns:cx6="http://schemas.microsoft.com/office/drawing/2016/5/12/chartex" xmlns:cx7="http://schemas.microsoft.com/office/drawing/2016/5/13/chartex" xmlns:cx8="http://schemas.microsoft.com/office/drawing/2016/5/14/chartex" xmlns:mc="http://schemas.openxmlformats.org/markup-compatibility/2006" xmlns:aink="http://schemas.microsoft.com/office/drawing/2016/ink" xmlns:am3d="http://schemas.microsoft.com/office/drawing/2017/model3d" xmlns:o="urn:schemas-microsoft-com:office:office" xmlns:oel="http://schemas.microsoft.com/office/2019/extlst" xmlns:r="http://schemas.openxmlformats.org/officeDocument/2006/relationships" xmlns:m="http://schemas.openxmlformats.org/officeDocument/2006/math" xmlns:v="urn:schemas-microsoft-com:vml" xmlns:wp14="http://schemas.microsoft.com/office/word/2010/wordprocessingDrawing" xmlns:wp="http://schemas.openxmlformats.org/drawingml/2006/wordprocessingDrawing" xmlns:w10="urn:schemas-microsoft-com:office:word" xmlns:w="http://schemas.openxmlformats.org/wordprocessingml/2006/main" xmlns:w14="http://schemas.microsoft.com/office/word/2010/wordml" xmlns:w15="http://schemas.microsoft.com/office/word/2012/wordml" xmlns:w16cex="http://schemas.microsoft.com/office/word/2018/wordml/cex" xmlns:w16cid="http://schemas.microsoft.com/office/word/2016/wordml/cid" xmlns:w16="http://schemas.microsoft.com/office/word/2018/wordml" xmlns:w16du="http://schemas.microsoft.com/office/word/2023/wordml/word16du" xmlns:w16sdtdh="http://schemas.microsoft.com/office/word/2020/wordml/sdtdatahash" xmlns:w16sdtfl="http://schemas.microsoft.com/office/word/2024/wordml/sdtformatlock" xmlns:w16se="http://schemas.microsoft.com/office/word/2015/wordml/symex" xmlns:wpg="http://schemas.microsoft.com/office/word/2010/wordprocessingGroup" xmlns:wpi="http://schemas.microsoft.com/office/word/2010/wordprocessingInk" xmlns:wne="http://schemas.microsoft.com/office/word/2006/wordml" xmlns:wps="http://schemas.microsoft.com/office/word/2010/wordprocessingShape" mc:Ignorable="w14 w15 w16se w16cid w16 w16cex w16sdtdh w16sdtfl w16du wp14">
   <w:p>
     <w:pPr>
-      <w:pStyle w:val="Header"/>
+      <w:pStyle w:val="Kopfzeile"/>
       <w:jc w:val="right"/>
     </w:pPr>
     <w:r>
@@ -1915,7 +1757,7 @@
 <w:hdr xmlns:wpc="http://schemas.microsoft.com/office/word/2010/wordprocessingCanvas" xmlns:cx="http://schemas.microsoft.com/office/drawing/2014/chartex" xmlns:cx1="http://schemas.microsoft.com/office/drawing/2015/9/8/chartex" xmlns:cx2="http://schemas.microsoft.com/office/drawing/2015/10/21/chartex" xmlns:cx3="http://schemas.microsoft.com/office/drawing/2016/5/9/chartex" xmlns:cx4="http://schemas.microsoft.com/office/drawing/2016/5/10/chartex" xmlns:cx5="http://schemas.microsoft.com/office/drawing/2016/5/11/chartex" xmlns:cx6="http://schemas.microsoft.com/office/drawing/2016/5/12/chartex" xmlns:cx7="http://schemas.microsoft.com/office/drawing/2016/5/13/chartex" xmlns:cx8="http://schemas.microsoft.com/office/drawing/2016/5/14/chartex" xmlns:mc="http://schemas.openxmlformats.org/markup-compatibility/2006" xmlns:aink="http://schemas.microsoft.com/office/drawing/2016/ink" xmlns:am3d="http://schemas.microsoft.com/office/drawing/2017/model3d" xmlns:o="urn:schemas-microsoft-com:office:office" xmlns:oel="http://schemas.microsoft.com/office/2019/extlst" xmlns:r="http://schemas.openxmlformats.org/officeDocument/2006/relationships" xmlns:m="http://schemas.openxmlformats.org/officeDocument/2006/math" xmlns:v="urn:schemas-microsoft-com:vml" xmlns:wp14="http://schemas.microsoft.com/office/word/2010/wordprocessingDrawing" xmlns:wp="http://schemas.openxmlformats.org/drawingml/2006/wordprocessingDrawing" xmlns:w10="urn:schemas-microsoft-com:office:word" xmlns:w="http://schemas.openxmlformats.org/wordprocessingml/2006/main" xmlns:w14="http://schemas.microsoft.com/office/word/2010/wordml" xmlns:w15="http://schemas.microsoft.com/office/word/2012/wordml" xmlns:w16cex="http://schemas.microsoft.com/office/word/2018/wordml/cex" xmlns:w16cid="http://schemas.microsoft.com/office/word/2016/wordml/cid" xmlns:w16="http://schemas.microsoft.com/office/word/2018/wordml" xmlns:w16du="http://schemas.microsoft.com/office/word/2023/wordml/word16du" xmlns:w16sdtdh="http://schemas.microsoft.com/office/word/2020/wordml/sdtdatahash" xmlns:w16sdtfl="http://schemas.microsoft.com/office/word/2024/wordml/sdtformatlock" xmlns:w16se="http://schemas.microsoft.com/office/word/2015/wordml/symex" xmlns:wpg="http://schemas.microsoft.com/office/word/2010/wordprocessingGroup" xmlns:wpi="http://schemas.microsoft.com/office/word/2010/wordprocessingInk" xmlns:wne="http://schemas.microsoft.com/office/word/2006/wordml" xmlns:wps="http://schemas.microsoft.com/office/word/2010/wordprocessingShape" mc:Ignorable="w14 w15 w16se w16cid w16 w16cex w16sdtdh w16sdtfl w16du wp14">
   <w:p>
     <w:pPr>
-      <w:pStyle w:val="Header"/>
+      <w:pStyle w:val="Kopfzeile"/>
     </w:pPr>
     <w:r>
       <w:tab/>
@@ -1931,43 +1773,43 @@
 <w:hdr xmlns:wpc="http://schemas.microsoft.com/office/word/2010/wordprocessingCanvas" xmlns:cx="http://schemas.microsoft.com/office/drawing/2014/chartex" xmlns:cx1="http://schemas.microsoft.com/office/drawing/2015/9/8/chartex" xmlns:cx2="http://schemas.microsoft.com/office/drawing/2015/10/21/chartex" xmlns:cx3="http://schemas.microsoft.com/office/drawing/2016/5/9/chartex" xmlns:cx4="http://schemas.microsoft.com/office/drawing/2016/5/10/chartex" xmlns:cx5="http://schemas.microsoft.com/office/drawing/2016/5/11/chartex" xmlns:cx6="http://schemas.microsoft.com/office/drawing/2016/5/12/chartex" xmlns:cx7="http://schemas.microsoft.com/office/drawing/2016/5/13/chartex" xmlns:cx8="http://schemas.microsoft.com/office/drawing/2016/5/14/chartex" xmlns:mc="http://schemas.openxmlformats.org/markup-compatibility/2006" xmlns:aink="http://schemas.microsoft.com/office/drawing/2016/ink" xmlns:am3d="http://schemas.microsoft.com/office/drawing/2017/model3d" xmlns:o="urn:schemas-microsoft-com:office:office" xmlns:oel="http://schemas.microsoft.com/office/2019/extlst" xmlns:r="http://schemas.openxmlformats.org/officeDocument/2006/relationships" xmlns:m="http://schemas.openxmlformats.org/officeDocument/2006/math" xmlns:v="urn:schemas-microsoft-com:vml" xmlns:wp14="http://schemas.microsoft.com/office/word/2010/wordprocessingDrawing" xmlns:wp="http://schemas.openxmlformats.org/drawingml/2006/wordprocessingDrawing" xmlns:w10="urn:schemas-microsoft-com:office:word" xmlns:w="http://schemas.openxmlformats.org/wordprocessingml/2006/main" xmlns:w14="http://schemas.microsoft.com/office/word/2010/wordml" xmlns:w15="http://schemas.microsoft.com/office/word/2012/wordml" xmlns:w16cex="http://schemas.microsoft.com/office/word/2018/wordml/cex" xmlns:w16cid="http://schemas.microsoft.com/office/word/2016/wordml/cid" xmlns:w16="http://schemas.microsoft.com/office/word/2018/wordml" xmlns:w16du="http://schemas.microsoft.com/office/word/2023/wordml/word16du" xmlns:w16sdtdh="http://schemas.microsoft.com/office/word/2020/wordml/sdtdatahash" xmlns:w16sdtfl="http://schemas.microsoft.com/office/word/2024/wordml/sdtformatlock" xmlns:w16se="http://schemas.microsoft.com/office/word/2015/wordml/symex" xmlns:wpg="http://schemas.microsoft.com/office/word/2010/wordprocessingGroup" xmlns:wpi="http://schemas.microsoft.com/office/word/2010/wordprocessingInk" xmlns:wne="http://schemas.microsoft.com/office/word/2006/wordml" xmlns:wps="http://schemas.microsoft.com/office/word/2010/wordprocessingShape" mc:Ignorable="w14 w15 w16se w16cid w16 w16cex w16sdtdh w16sdtfl w16du wp14">
   <w:p>
     <w:pPr>
-      <w:pStyle w:val="Header"/>
+      <w:pStyle w:val="Kopfzeile"/>
       <w:pBdr>
         <w:bottom w:val="single" w:sz="8" w:space="6" w:color="auto"/>
       </w:pBdr>
       <w:jc w:val="right"/>
       <w:rPr>
-        <w:rStyle w:val="PageNumber"/>
+        <w:rStyle w:val="Seitenzahl"/>
       </w:rPr>
     </w:pPr>
     <w:r>
       <w:rPr>
-        <w:rStyle w:val="PageNumber"/>
+        <w:rStyle w:val="Seitenzahl"/>
       </w:rPr>
       <w:fldChar w:fldCharType="begin"/>
     </w:r>
     <w:r>
       <w:rPr>
-        <w:rStyle w:val="PageNumber"/>
+        <w:rStyle w:val="Seitenzahl"/>
       </w:rPr>
       <w:instrText xml:space="preserve"> PAGE  \* ROMAN  \* MERGEFORMAT </w:instrText>
     </w:r>
     <w:r>
       <w:rPr>
-        <w:rStyle w:val="PageNumber"/>
+        <w:rStyle w:val="Seitenzahl"/>
       </w:rPr>
       <w:fldChar w:fldCharType="separate"/>
     </w:r>
     <w:r>
       <w:rPr>
-        <w:rStyle w:val="PageNumber"/>
+        <w:rStyle w:val="Seitenzahl"/>
         <w:noProof/>
       </w:rPr>
       <w:t>IV</w:t>
     </w:r>
     <w:r>
       <w:rPr>
-        <w:rStyle w:val="PageNumber"/>
+        <w:rStyle w:val="Seitenzahl"/>
       </w:rPr>
       <w:fldChar w:fldCharType="end"/>
     </w:r>
@@ -1979,54 +1821,54 @@
 <w:hdr xmlns:wpc="http://schemas.microsoft.com/office/word/2010/wordprocessingCanvas" xmlns:cx="http://schemas.microsoft.com/office/drawing/2014/chartex" xmlns:cx1="http://schemas.microsoft.com/office/drawing/2015/9/8/chartex" xmlns:cx2="http://schemas.microsoft.com/office/drawing/2015/10/21/chartex" xmlns:cx3="http://schemas.microsoft.com/office/drawing/2016/5/9/chartex" xmlns:cx4="http://schemas.microsoft.com/office/drawing/2016/5/10/chartex" xmlns:cx5="http://schemas.microsoft.com/office/drawing/2016/5/11/chartex" xmlns:cx6="http://schemas.microsoft.com/office/drawing/2016/5/12/chartex" xmlns:cx7="http://schemas.microsoft.com/office/drawing/2016/5/13/chartex" xmlns:cx8="http://schemas.microsoft.com/office/drawing/2016/5/14/chartex" xmlns:mc="http://schemas.openxmlformats.org/markup-compatibility/2006" xmlns:aink="http://schemas.microsoft.com/office/drawing/2016/ink" xmlns:am3d="http://schemas.microsoft.com/office/drawing/2017/model3d" xmlns:o="urn:schemas-microsoft-com:office:office" xmlns:oel="http://schemas.microsoft.com/office/2019/extlst" xmlns:r="http://schemas.openxmlformats.org/officeDocument/2006/relationships" xmlns:m="http://schemas.openxmlformats.org/officeDocument/2006/math" xmlns:v="urn:schemas-microsoft-com:vml" xmlns:wp14="http://schemas.microsoft.com/office/word/2010/wordprocessingDrawing" xmlns:wp="http://schemas.openxmlformats.org/drawingml/2006/wordprocessingDrawing" xmlns:w10="urn:schemas-microsoft-com:office:word" xmlns:w="http://schemas.openxmlformats.org/wordprocessingml/2006/main" xmlns:w14="http://schemas.microsoft.com/office/word/2010/wordml" xmlns:w15="http://schemas.microsoft.com/office/word/2012/wordml" xmlns:w16cex="http://schemas.microsoft.com/office/word/2018/wordml/cex" xmlns:w16cid="http://schemas.microsoft.com/office/word/2016/wordml/cid" xmlns:w16="http://schemas.microsoft.com/office/word/2018/wordml" xmlns:w16du="http://schemas.microsoft.com/office/word/2023/wordml/word16du" xmlns:w16sdtdh="http://schemas.microsoft.com/office/word/2020/wordml/sdtdatahash" xmlns:w16sdtfl="http://schemas.microsoft.com/office/word/2024/wordml/sdtformatlock" xmlns:w16se="http://schemas.microsoft.com/office/word/2015/wordml/symex" xmlns:wpg="http://schemas.microsoft.com/office/word/2010/wordprocessingGroup" xmlns:wpi="http://schemas.microsoft.com/office/word/2010/wordprocessingInk" xmlns:wne="http://schemas.microsoft.com/office/word/2006/wordml" xmlns:wps="http://schemas.microsoft.com/office/word/2010/wordprocessingShape" mc:Ignorable="w14 w15 w16se w16cid w16 w16cex w16sdtdh w16sdtfl w16du wp14">
   <w:p>
     <w:pPr>
-      <w:pStyle w:val="Header"/>
+      <w:pStyle w:val="Kopfzeile"/>
       <w:pBdr>
         <w:bottom w:val="single" w:sz="8" w:space="6" w:color="auto"/>
       </w:pBdr>
       <w:rPr>
-        <w:rStyle w:val="PageNumber"/>
+        <w:rStyle w:val="Seitenzahl"/>
       </w:rPr>
     </w:pPr>
     <w:r>
       <w:rPr>
-        <w:rStyle w:val="PageNumber"/>
+        <w:rStyle w:val="Seitenzahl"/>
       </w:rPr>
       <w:tab/>
     </w:r>
     <w:r>
       <w:rPr>
-        <w:rStyle w:val="PageNumber"/>
+        <w:rStyle w:val="Seitenzahl"/>
       </w:rPr>
       <w:tab/>
     </w:r>
     <w:r>
       <w:rPr>
-        <w:rStyle w:val="PageNumber"/>
+        <w:rStyle w:val="Seitenzahl"/>
       </w:rPr>
       <w:fldChar w:fldCharType="begin"/>
     </w:r>
     <w:r>
       <w:rPr>
-        <w:rStyle w:val="PageNumber"/>
+        <w:rStyle w:val="Seitenzahl"/>
       </w:rPr>
       <w:instrText xml:space="preserve"> PAGE  \* ROMAN  \* MERGEFORMAT </w:instrText>
     </w:r>
     <w:r>
       <w:rPr>
-        <w:rStyle w:val="PageNumber"/>
+        <w:rStyle w:val="Seitenzahl"/>
       </w:rPr>
       <w:fldChar w:fldCharType="separate"/>
     </w:r>
     <w:r>
       <w:rPr>
-        <w:rStyle w:val="PageNumber"/>
+        <w:rStyle w:val="Seitenzahl"/>
         <w:noProof/>
       </w:rPr>
       <w:t>III</w:t>
     </w:r>
     <w:r>
       <w:rPr>
-        <w:rStyle w:val="PageNumber"/>
+        <w:rStyle w:val="Seitenzahl"/>
       </w:rPr>
       <w:fldChar w:fldCharType="end"/>
     </w:r>
@@ -2038,7 +1880,7 @@
 <w:hdr xmlns:wpc="http://schemas.microsoft.com/office/word/2010/wordprocessingCanvas" xmlns:cx="http://schemas.microsoft.com/office/drawing/2014/chartex" xmlns:cx1="http://schemas.microsoft.com/office/drawing/2015/9/8/chartex" xmlns:cx2="http://schemas.microsoft.com/office/drawing/2015/10/21/chartex" xmlns:cx3="http://schemas.microsoft.com/office/drawing/2016/5/9/chartex" xmlns:cx4="http://schemas.microsoft.com/office/drawing/2016/5/10/chartex" xmlns:cx5="http://schemas.microsoft.com/office/drawing/2016/5/11/chartex" xmlns:cx6="http://schemas.microsoft.com/office/drawing/2016/5/12/chartex" xmlns:cx7="http://schemas.microsoft.com/office/drawing/2016/5/13/chartex" xmlns:cx8="http://schemas.microsoft.com/office/drawing/2016/5/14/chartex" xmlns:mc="http://schemas.openxmlformats.org/markup-compatibility/2006" xmlns:aink="http://schemas.microsoft.com/office/drawing/2016/ink" xmlns:am3d="http://schemas.microsoft.com/office/drawing/2017/model3d" xmlns:o="urn:schemas-microsoft-com:office:office" xmlns:oel="http://schemas.microsoft.com/office/2019/extlst" xmlns:r="http://schemas.openxmlformats.org/officeDocument/2006/relationships" xmlns:m="http://schemas.openxmlformats.org/officeDocument/2006/math" xmlns:v="urn:schemas-microsoft-com:vml" xmlns:wp14="http://schemas.microsoft.com/office/word/2010/wordprocessingDrawing" xmlns:wp="http://schemas.openxmlformats.org/drawingml/2006/wordprocessingDrawing" xmlns:w10="urn:schemas-microsoft-com:office:word" xmlns:w="http://schemas.openxmlformats.org/wordprocessingml/2006/main" xmlns:w14="http://schemas.microsoft.com/office/word/2010/wordml" xmlns:w15="http://schemas.microsoft.com/office/word/2012/wordml" xmlns:w16cex="http://schemas.microsoft.com/office/word/2018/wordml/cex" xmlns:w16cid="http://schemas.microsoft.com/office/word/2016/wordml/cid" xmlns:w16="http://schemas.microsoft.com/office/word/2018/wordml" xmlns:w16du="http://schemas.microsoft.com/office/word/2023/wordml/word16du" xmlns:w16sdtdh="http://schemas.microsoft.com/office/word/2020/wordml/sdtdatahash" xmlns:w16sdtfl="http://schemas.microsoft.com/office/word/2024/wordml/sdtformatlock" xmlns:w16se="http://schemas.microsoft.com/office/word/2015/wordml/symex" xmlns:wpg="http://schemas.microsoft.com/office/word/2010/wordprocessingGroup" xmlns:wpi="http://schemas.microsoft.com/office/word/2010/wordprocessingInk" xmlns:wne="http://schemas.microsoft.com/office/word/2006/wordml" xmlns:wps="http://schemas.microsoft.com/office/word/2010/wordprocessingShape" mc:Ignorable="w14 w15 w16se w16cid w16 w16cex w16sdtdh w16sdtfl w16du wp14">
   <w:p>
     <w:pPr>
-      <w:pStyle w:val="Header"/>
+      <w:pStyle w:val="Kopfzeile"/>
       <w:pBdr>
         <w:bottom w:val="single" w:sz="8" w:space="6" w:color="auto"/>
       </w:pBdr>
@@ -2069,7 +1911,7 @@
 <w:hdr xmlns:wpc="http://schemas.microsoft.com/office/word/2010/wordprocessingCanvas" xmlns:cx="http://schemas.microsoft.com/office/drawing/2014/chartex" xmlns:cx1="http://schemas.microsoft.com/office/drawing/2015/9/8/chartex" xmlns:cx2="http://schemas.microsoft.com/office/drawing/2015/10/21/chartex" xmlns:cx3="http://schemas.microsoft.com/office/drawing/2016/5/9/chartex" xmlns:cx4="http://schemas.microsoft.com/office/drawing/2016/5/10/chartex" xmlns:cx5="http://schemas.microsoft.com/office/drawing/2016/5/11/chartex" xmlns:cx6="http://schemas.microsoft.com/office/drawing/2016/5/12/chartex" xmlns:cx7="http://schemas.microsoft.com/office/drawing/2016/5/13/chartex" xmlns:cx8="http://schemas.microsoft.com/office/drawing/2016/5/14/chartex" xmlns:mc="http://schemas.openxmlformats.org/markup-compatibility/2006" xmlns:aink="http://schemas.microsoft.com/office/drawing/2016/ink" xmlns:am3d="http://schemas.microsoft.com/office/drawing/2017/model3d" xmlns:o="urn:schemas-microsoft-com:office:office" xmlns:oel="http://schemas.microsoft.com/office/2019/extlst" xmlns:r="http://schemas.openxmlformats.org/officeDocument/2006/relationships" xmlns:m="http://schemas.openxmlformats.org/officeDocument/2006/math" xmlns:v="urn:schemas-microsoft-com:vml" xmlns:wp14="http://schemas.microsoft.com/office/word/2010/wordprocessingDrawing" xmlns:wp="http://schemas.openxmlformats.org/drawingml/2006/wordprocessingDrawing" xmlns:w10="urn:schemas-microsoft-com:office:word" xmlns:w="http://schemas.openxmlformats.org/wordprocessingml/2006/main" xmlns:w14="http://schemas.microsoft.com/office/word/2010/wordml" xmlns:w15="http://schemas.microsoft.com/office/word/2012/wordml" xmlns:w16cex="http://schemas.microsoft.com/office/word/2018/wordml/cex" xmlns:w16cid="http://schemas.microsoft.com/office/word/2016/wordml/cid" xmlns:w16="http://schemas.microsoft.com/office/word/2018/wordml" xmlns:w16du="http://schemas.microsoft.com/office/word/2023/wordml/word16du" xmlns:w16sdtdh="http://schemas.microsoft.com/office/word/2020/wordml/sdtdatahash" xmlns:w16sdtfl="http://schemas.microsoft.com/office/word/2024/wordml/sdtformatlock" xmlns:w16se="http://schemas.microsoft.com/office/word/2015/wordml/symex" xmlns:wpg="http://schemas.microsoft.com/office/word/2010/wordprocessingGroup" xmlns:wpi="http://schemas.microsoft.com/office/word/2010/wordprocessingInk" xmlns:wne="http://schemas.microsoft.com/office/word/2006/wordml" xmlns:wps="http://schemas.microsoft.com/office/word/2010/wordprocessingShape" mc:Ignorable="w14 w15 w16se w16cid w16 w16cex w16sdtdh w16sdtfl w16du wp14">
   <w:p>
     <w:pPr>
-      <w:pStyle w:val="Header"/>
+      <w:pStyle w:val="Kopfzeile"/>
       <w:pBdr>
         <w:bottom w:val="single" w:sz="8" w:space="6" w:color="auto"/>
       </w:pBdr>
@@ -2337,7 +2179,7 @@
     <w:lvl w:ilvl="0" w:tplc="0DEA46EC">
       <w:start w:val="1"/>
       <w:numFmt w:val="bullet"/>
-      <w:pStyle w:val="ListParagraph"/>
+      <w:pStyle w:val="Listenabsatz"/>
       <w:lvlText w:val=""/>
       <w:lvlJc w:val="left"/>
       <w:pPr>
@@ -2677,7 +2519,7 @@
     <w:lvl w:ilvl="0">
       <w:start w:val="1"/>
       <w:numFmt w:val="decimal"/>
-      <w:pStyle w:val="Heading1"/>
+      <w:pStyle w:val="berschrift1"/>
       <w:lvlText w:val="%1"/>
       <w:lvlJc w:val="left"/>
       <w:pPr>
@@ -2687,7 +2529,7 @@
     <w:lvl w:ilvl="1">
       <w:start w:val="1"/>
       <w:numFmt w:val="decimal"/>
-      <w:pStyle w:val="Heading2"/>
+      <w:pStyle w:val="berschrift2"/>
       <w:lvlText w:val="%1.%2"/>
       <w:lvlJc w:val="left"/>
       <w:pPr>
@@ -2697,7 +2539,7 @@
     <w:lvl w:ilvl="2">
       <w:start w:val="1"/>
       <w:numFmt w:val="decimal"/>
-      <w:pStyle w:val="Heading3"/>
+      <w:pStyle w:val="berschrift3"/>
       <w:lvlText w:val="%1.%2.%3"/>
       <w:lvlJc w:val="left"/>
       <w:pPr>
@@ -2707,7 +2549,7 @@
     <w:lvl w:ilvl="3">
       <w:start w:val="1"/>
       <w:numFmt w:val="decimal"/>
-      <w:pStyle w:val="Heading4"/>
+      <w:pStyle w:val="berschrift4"/>
       <w:lvlText w:val="%1.%2.%3.%4"/>
       <w:lvlJc w:val="left"/>
       <w:pPr>
@@ -2744,7 +2586,7 @@
     <w:lvl w:ilvl="4">
       <w:start w:val="1"/>
       <w:numFmt w:val="decimal"/>
-      <w:pStyle w:val="Heading5"/>
+      <w:pStyle w:val="berschrift5"/>
       <w:lvlText w:val="%1.%2.%3.%4.%5"/>
       <w:lvlJc w:val="left"/>
       <w:pPr>
@@ -3260,10 +3102,10 @@
     <w:lsdException w:name="Smart Hyperlink" w:semiHidden="1" w:unhideWhenUsed="1"/>
     <w:lsdException w:name="Smart Link" w:semiHidden="1" w:unhideWhenUsed="1"/>
   </w:latentStyles>
-  <w:style w:type="paragraph" w:default="1" w:styleId="Normal">
+  <w:style w:type="paragraph" w:default="1" w:styleId="Standard">
     <w:name w:val="Normal"/>
     <w:qFormat/>
-    <w:rsid w:val="006613C2"/>
+    <w:rsid w:val="00DC23E0"/>
     <w:pPr>
       <w:spacing w:after="120" w:line="312" w:lineRule="auto"/>
     </w:pPr>
@@ -3271,14 +3113,14 @@
       <w:rFonts w:ascii="Times New Roman" w:hAnsi="Times New Roman"/>
       <w:color w:val="000000"/>
       <w:sz w:val="24"/>
-      <w:lang w:val="de-CH" w:eastAsia="en-US"/>
-    </w:rPr>
-  </w:style>
-  <w:style w:type="paragraph" w:styleId="Heading1">
+      <w:lang w:val="en-GB" w:eastAsia="en-US"/>
+    </w:rPr>
+  </w:style>
+  <w:style w:type="paragraph" w:styleId="berschrift1">
     <w:name w:val="heading 1"/>
-    <w:basedOn w:val="Normal"/>
-    <w:next w:val="BodyText"/>
-    <w:link w:val="Heading1Char"/>
+    <w:basedOn w:val="Standard"/>
+    <w:next w:val="Textkrper"/>
+    <w:link w:val="berschrift1Zchn"/>
     <w:uiPriority w:val="4"/>
     <w:qFormat/>
     <w:rsid w:val="00BD26F9"/>
@@ -3301,11 +3143,11 @@
       <w:lang w:eastAsia="de-DE"/>
     </w:rPr>
   </w:style>
-  <w:style w:type="paragraph" w:styleId="Heading2">
+  <w:style w:type="paragraph" w:styleId="berschrift2">
     <w:name w:val="heading 2"/>
-    <w:basedOn w:val="Heading1"/>
-    <w:next w:val="BodyText"/>
-    <w:link w:val="Heading2Char"/>
+    <w:basedOn w:val="berschrift1"/>
+    <w:next w:val="Textkrper"/>
+    <w:link w:val="berschrift2Zchn"/>
     <w:uiPriority w:val="4"/>
     <w:qFormat/>
     <w:rsid w:val="00F25C86"/>
@@ -3323,11 +3165,11 @@
       <w:szCs w:val="28"/>
     </w:rPr>
   </w:style>
-  <w:style w:type="paragraph" w:styleId="Heading3">
+  <w:style w:type="paragraph" w:styleId="berschrift3">
     <w:name w:val="heading 3"/>
-    <w:basedOn w:val="Heading2"/>
-    <w:next w:val="BodyText"/>
-    <w:link w:val="Heading3Char"/>
+    <w:basedOn w:val="berschrift2"/>
+    <w:next w:val="Textkrper"/>
+    <w:link w:val="berschrift3Zchn"/>
     <w:uiPriority w:val="4"/>
     <w:qFormat/>
     <w:rsid w:val="00F25C86"/>
@@ -3346,11 +3188,11 @@
       <w:szCs w:val="20"/>
     </w:rPr>
   </w:style>
-  <w:style w:type="paragraph" w:styleId="Heading4">
+  <w:style w:type="paragraph" w:styleId="berschrift4">
     <w:name w:val="heading 4"/>
-    <w:basedOn w:val="Heading3"/>
-    <w:next w:val="BodyText"/>
-    <w:link w:val="Heading4Char"/>
+    <w:basedOn w:val="berschrift3"/>
+    <w:next w:val="Textkrper"/>
+    <w:link w:val="berschrift4Zchn"/>
     <w:uiPriority w:val="4"/>
     <w:qFormat/>
     <w:rsid w:val="009D23A6"/>
@@ -3372,11 +3214,11 @@
       <w:iCs w:val="0"/>
     </w:rPr>
   </w:style>
-  <w:style w:type="paragraph" w:styleId="Heading5">
+  <w:style w:type="paragraph" w:styleId="berschrift5">
     <w:name w:val="heading 5"/>
-    <w:basedOn w:val="Heading4"/>
-    <w:next w:val="Normal"/>
-    <w:link w:val="Heading5Char"/>
+    <w:basedOn w:val="berschrift4"/>
+    <w:next w:val="Standard"/>
+    <w:link w:val="berschrift5Zchn"/>
     <w:uiPriority w:val="4"/>
     <w:qFormat/>
     <w:rsid w:val="009D23A6"/>
@@ -3391,11 +3233,11 @@
       <w:b w:val="0"/>
     </w:rPr>
   </w:style>
-  <w:style w:type="paragraph" w:styleId="Heading6">
+  <w:style w:type="paragraph" w:styleId="berschrift6">
     <w:name w:val="heading 6"/>
-    <w:basedOn w:val="Normal"/>
-    <w:next w:val="Normal"/>
-    <w:link w:val="Heading6Char"/>
+    <w:basedOn w:val="Standard"/>
+    <w:next w:val="Standard"/>
+    <w:link w:val="berschrift6Zchn"/>
     <w:uiPriority w:val="9"/>
     <w:semiHidden/>
     <w:unhideWhenUsed/>
@@ -3413,13 +3255,13 @@
       <w:color w:val="082D16"/>
     </w:rPr>
   </w:style>
-  <w:style w:type="character" w:default="1" w:styleId="DefaultParagraphFont">
+  <w:style w:type="character" w:default="1" w:styleId="Absatz-Standardschriftart">
     <w:name w:val="Default Paragraph Font"/>
     <w:uiPriority w:val="1"/>
     <w:semiHidden/>
     <w:unhideWhenUsed/>
   </w:style>
-  <w:style w:type="table" w:default="1" w:styleId="TableNormal">
+  <w:style w:type="table" w:default="1" w:styleId="NormaleTabelle">
     <w:name w:val="Normal Table"/>
     <w:uiPriority w:val="99"/>
     <w:semiHidden/>
@@ -3434,15 +3276,15 @@
       </w:tblCellMar>
     </w:tblPr>
   </w:style>
-  <w:style w:type="numbering" w:default="1" w:styleId="NoList">
+  <w:style w:type="numbering" w:default="1" w:styleId="KeineListe">
     <w:name w:val="No List"/>
     <w:uiPriority w:val="99"/>
     <w:semiHidden/>
     <w:unhideWhenUsed/>
   </w:style>
-  <w:style w:type="character" w:customStyle="1" w:styleId="Heading1Char">
-    <w:name w:val="Heading 1 Char"/>
-    <w:link w:val="Heading1"/>
+  <w:style w:type="character" w:customStyle="1" w:styleId="berschrift1Zchn">
+    <w:name w:val="Überschrift 1 Zchn"/>
+    <w:link w:val="berschrift1"/>
     <w:uiPriority w:val="4"/>
     <w:rsid w:val="005E7020"/>
     <w:rPr>
@@ -3455,9 +3297,9 @@
       <w:lang w:eastAsia="de-DE"/>
     </w:rPr>
   </w:style>
-  <w:style w:type="character" w:customStyle="1" w:styleId="Heading2Char">
-    <w:name w:val="Heading 2 Char"/>
-    <w:link w:val="Heading2"/>
+  <w:style w:type="character" w:customStyle="1" w:styleId="berschrift2Zchn">
+    <w:name w:val="Überschrift 2 Zchn"/>
+    <w:link w:val="berschrift2"/>
     <w:uiPriority w:val="4"/>
     <w:rsid w:val="005E7020"/>
     <w:rPr>
@@ -3470,9 +3312,9 @@
       <w:lang w:eastAsia="de-DE"/>
     </w:rPr>
   </w:style>
-  <w:style w:type="character" w:customStyle="1" w:styleId="Heading3Char">
-    <w:name w:val="Heading 3 Char"/>
-    <w:link w:val="Heading3"/>
+  <w:style w:type="character" w:customStyle="1" w:styleId="berschrift3Zchn">
+    <w:name w:val="Überschrift 3 Zchn"/>
+    <w:link w:val="berschrift3"/>
     <w:uiPriority w:val="4"/>
     <w:rsid w:val="005E7020"/>
     <w:rPr>
@@ -3485,9 +3327,9 @@
       <w:lang w:eastAsia="de-DE"/>
     </w:rPr>
   </w:style>
-  <w:style w:type="character" w:customStyle="1" w:styleId="Heading4Char">
-    <w:name w:val="Heading 4 Char"/>
-    <w:link w:val="Heading4"/>
+  <w:style w:type="character" w:customStyle="1" w:styleId="berschrift4Zchn">
+    <w:name w:val="Überschrift 4 Zchn"/>
+    <w:link w:val="berschrift4"/>
     <w:uiPriority w:val="4"/>
     <w:rsid w:val="009D23A6"/>
     <w:rPr>
@@ -3499,9 +3341,9 @@
       <w:lang w:eastAsia="de-DE"/>
     </w:rPr>
   </w:style>
-  <w:style w:type="character" w:customStyle="1" w:styleId="Heading5Char">
-    <w:name w:val="Heading 5 Char"/>
-    <w:link w:val="Heading5"/>
+  <w:style w:type="character" w:customStyle="1" w:styleId="berschrift5Zchn">
+    <w:name w:val="Überschrift 5 Zchn"/>
+    <w:link w:val="berschrift5"/>
     <w:uiPriority w:val="4"/>
     <w:rsid w:val="009D23A6"/>
     <w:rPr>
@@ -3512,7 +3354,7 @@
       <w:lang w:eastAsia="de-DE"/>
     </w:rPr>
   </w:style>
-  <w:style w:type="character" w:styleId="PageNumber">
+  <w:style w:type="character" w:styleId="Seitenzahl">
     <w:name w:val="page number"/>
     <w:uiPriority w:val="9"/>
     <w:qFormat/>
@@ -3524,9 +3366,9 @@
       <w:szCs w:val="18"/>
     </w:rPr>
   </w:style>
-  <w:style w:type="character" w:customStyle="1" w:styleId="Heading6Char">
-    <w:name w:val="Heading 6 Char"/>
-    <w:link w:val="Heading6"/>
+  <w:style w:type="character" w:customStyle="1" w:styleId="berschrift6Zchn">
+    <w:name w:val="Überschrift 6 Zchn"/>
+    <w:link w:val="berschrift6"/>
     <w:uiPriority w:val="9"/>
     <w:semiHidden/>
     <w:rsid w:val="005E7020"/>
@@ -3538,11 +3380,11 @@
       <w:sz w:val="26"/>
     </w:rPr>
   </w:style>
-  <w:style w:type="paragraph" w:styleId="Title">
+  <w:style w:type="paragraph" w:styleId="Titel">
     <w:name w:val="Title"/>
-    <w:basedOn w:val="Normal"/>
-    <w:next w:val="Normal"/>
-    <w:link w:val="TitleChar"/>
+    <w:basedOn w:val="Standard"/>
+    <w:next w:val="Standard"/>
+    <w:link w:val="TitelZchn"/>
     <w:uiPriority w:val="14"/>
     <w:qFormat/>
     <w:rsid w:val="007D4925"/>
@@ -3560,9 +3402,9 @@
       <w:szCs w:val="52"/>
     </w:rPr>
   </w:style>
-  <w:style w:type="character" w:customStyle="1" w:styleId="TitleChar">
-    <w:name w:val="Title Char"/>
-    <w:link w:val="Title"/>
+  <w:style w:type="character" w:customStyle="1" w:styleId="TitelZchn">
+    <w:name w:val="Titel Zchn"/>
+    <w:link w:val="Titel"/>
     <w:uiPriority w:val="14"/>
     <w:rsid w:val="005E7020"/>
     <w:rPr>
@@ -3575,11 +3417,11 @@
       <w:szCs w:val="52"/>
     </w:rPr>
   </w:style>
-  <w:style w:type="paragraph" w:styleId="Subtitle">
+  <w:style w:type="paragraph" w:styleId="Untertitel">
     <w:name w:val="Subtitle"/>
-    <w:basedOn w:val="Normal"/>
-    <w:next w:val="Normal"/>
-    <w:link w:val="SubtitleChar"/>
+    <w:basedOn w:val="Standard"/>
+    <w:next w:val="Standard"/>
+    <w:link w:val="UntertitelZchn"/>
     <w:uiPriority w:val="15"/>
     <w:qFormat/>
     <w:rsid w:val="007D4925"/>
@@ -3598,9 +3440,9 @@
       <w:szCs w:val="24"/>
     </w:rPr>
   </w:style>
-  <w:style w:type="character" w:customStyle="1" w:styleId="SubtitleChar">
-    <w:name w:val="Subtitle Char"/>
-    <w:link w:val="Subtitle"/>
+  <w:style w:type="character" w:customStyle="1" w:styleId="UntertitelZchn">
+    <w:name w:val="Untertitel Zchn"/>
+    <w:link w:val="Untertitel"/>
     <w:uiPriority w:val="15"/>
     <w:rsid w:val="005E7020"/>
     <w:rPr>
@@ -3613,7 +3455,7 @@
       <w:szCs w:val="24"/>
     </w:rPr>
   </w:style>
-  <w:style w:type="character" w:styleId="SubtleEmphasis">
+  <w:style w:type="character" w:styleId="SchwacheHervorhebung">
     <w:name w:val="Subtle Emphasis"/>
     <w:uiPriority w:val="19"/>
     <w:semiHidden/>
@@ -3624,7 +3466,7 @@
       <w:color w:val="808080"/>
     </w:rPr>
   </w:style>
-  <w:style w:type="character" w:styleId="IntenseReference">
+  <w:style w:type="character" w:styleId="IntensiverVerweis">
     <w:name w:val="Intense Reference"/>
     <w:uiPriority w:val="32"/>
     <w:semiHidden/>
@@ -3638,9 +3480,9 @@
       <w:u w:val="single"/>
     </w:rPr>
   </w:style>
-  <w:style w:type="paragraph" w:styleId="ListParagraph">
+  <w:style w:type="paragraph" w:styleId="Listenabsatz">
     <w:name w:val="List Paragraph"/>
-    <w:basedOn w:val="Normal"/>
+    <w:basedOn w:val="Standard"/>
     <w:uiPriority w:val="9"/>
     <w:qFormat/>
     <w:rsid w:val="000C5089"/>
@@ -3652,7 +3494,7 @@
       <w:contextualSpacing/>
     </w:pPr>
   </w:style>
-  <w:style w:type="character" w:styleId="Strong">
+  <w:style w:type="character" w:styleId="Fett">
     <w:name w:val="Strong"/>
     <w:uiPriority w:val="12"/>
     <w:qFormat/>
@@ -3662,10 +3504,10 @@
       <w:bCs/>
     </w:rPr>
   </w:style>
-  <w:style w:type="paragraph" w:styleId="BodyText">
+  <w:style w:type="paragraph" w:styleId="Textkrper">
     <w:name w:val="Body Text"/>
-    <w:basedOn w:val="Normal"/>
-    <w:link w:val="BodyTextChar"/>
+    <w:basedOn w:val="Standard"/>
+    <w:link w:val="TextkrperZchn"/>
     <w:uiPriority w:val="99"/>
     <w:unhideWhenUsed/>
     <w:rsid w:val="0087578D"/>
@@ -3673,9 +3515,9 @@
       <w:jc w:val="both"/>
     </w:pPr>
   </w:style>
-  <w:style w:type="character" w:customStyle="1" w:styleId="BodyTextChar">
-    <w:name w:val="Body Text Char"/>
-    <w:link w:val="BodyText"/>
+  <w:style w:type="character" w:customStyle="1" w:styleId="TextkrperZchn">
+    <w:name w:val="Textkörper Zchn"/>
+    <w:link w:val="Textkrper"/>
     <w:uiPriority w:val="99"/>
     <w:rsid w:val="0087578D"/>
     <w:rPr>
@@ -3685,10 +3527,10 @@
       <w:lang w:val="de-CH" w:eastAsia="en-US"/>
     </w:rPr>
   </w:style>
-  <w:style w:type="paragraph" w:styleId="Header">
+  <w:style w:type="paragraph" w:styleId="Kopfzeile">
     <w:name w:val="header"/>
-    <w:basedOn w:val="Normal"/>
-    <w:link w:val="HeaderChar"/>
+    <w:basedOn w:val="Standard"/>
+    <w:link w:val="KopfzeileZchn"/>
     <w:uiPriority w:val="11"/>
     <w:unhideWhenUsed/>
     <w:qFormat/>
@@ -3705,9 +3547,9 @@
       <w:szCs w:val="16"/>
     </w:rPr>
   </w:style>
-  <w:style w:type="character" w:customStyle="1" w:styleId="HeaderChar">
-    <w:name w:val="Header Char"/>
-    <w:link w:val="Header"/>
+  <w:style w:type="character" w:customStyle="1" w:styleId="KopfzeileZchn">
+    <w:name w:val="Kopfzeile Zchn"/>
+    <w:link w:val="Kopfzeile"/>
     <w:uiPriority w:val="11"/>
     <w:rsid w:val="005E7020"/>
     <w:rPr>
@@ -3717,10 +3559,10 @@
       <w:szCs w:val="16"/>
     </w:rPr>
   </w:style>
-  <w:style w:type="paragraph" w:styleId="Footer">
+  <w:style w:type="paragraph" w:styleId="Fuzeile">
     <w:name w:val="footer"/>
-    <w:basedOn w:val="Normal"/>
-    <w:link w:val="FooterChar"/>
+    <w:basedOn w:val="Standard"/>
+    <w:link w:val="FuzeileZchn"/>
     <w:uiPriority w:val="11"/>
     <w:unhideWhenUsed/>
     <w:qFormat/>
@@ -3737,9 +3579,9 @@
       <w:szCs w:val="16"/>
     </w:rPr>
   </w:style>
-  <w:style w:type="character" w:customStyle="1" w:styleId="FooterChar">
-    <w:name w:val="Footer Char"/>
-    <w:link w:val="Footer"/>
+  <w:style w:type="character" w:customStyle="1" w:styleId="FuzeileZchn">
+    <w:name w:val="Fußzeile Zchn"/>
+    <w:link w:val="Fuzeile"/>
     <w:uiPriority w:val="11"/>
     <w:rsid w:val="005E7020"/>
     <w:rPr>
@@ -3749,10 +3591,10 @@
       <w:szCs w:val="16"/>
     </w:rPr>
   </w:style>
-  <w:style w:type="paragraph" w:styleId="TOC1">
+  <w:style w:type="paragraph" w:styleId="Verzeichnis1">
     <w:name w:val="toc 1"/>
-    <w:basedOn w:val="Normal"/>
-    <w:next w:val="Normal"/>
+    <w:basedOn w:val="Standard"/>
+    <w:next w:val="Standard"/>
     <w:autoRedefine/>
     <w:uiPriority w:val="39"/>
     <w:unhideWhenUsed/>
@@ -3768,10 +3610,10 @@
       <w:noProof/>
     </w:rPr>
   </w:style>
-  <w:style w:type="paragraph" w:styleId="TOC2">
+  <w:style w:type="paragraph" w:styleId="Verzeichnis2">
     <w:name w:val="toc 2"/>
-    <w:basedOn w:val="TOC1"/>
-    <w:next w:val="Normal"/>
+    <w:basedOn w:val="Verzeichnis1"/>
+    <w:next w:val="Standard"/>
     <w:autoRedefine/>
     <w:uiPriority w:val="39"/>
     <w:unhideWhenUsed/>
@@ -3784,10 +3626,10 @@
       <w:ind w:left="198"/>
     </w:pPr>
   </w:style>
-  <w:style w:type="paragraph" w:styleId="TOC3">
+  <w:style w:type="paragraph" w:styleId="Verzeichnis3">
     <w:name w:val="toc 3"/>
-    <w:basedOn w:val="TOC2"/>
-    <w:next w:val="Normal"/>
+    <w:basedOn w:val="Verzeichnis2"/>
+    <w:next w:val="Standard"/>
     <w:autoRedefine/>
     <w:uiPriority w:val="39"/>
     <w:unhideWhenUsed/>
@@ -3813,10 +3655,10 @@
       <w:u w:val="single"/>
     </w:rPr>
   </w:style>
-  <w:style w:type="paragraph" w:styleId="TOC4">
+  <w:style w:type="paragraph" w:styleId="Verzeichnis4">
     <w:name w:val="toc 4"/>
-    <w:basedOn w:val="TOC3"/>
-    <w:next w:val="Normal"/>
+    <w:basedOn w:val="Verzeichnis3"/>
+    <w:next w:val="Standard"/>
     <w:autoRedefine/>
     <w:uiPriority w:val="39"/>
     <w:unhideWhenUsed/>
@@ -3833,10 +3675,10 @@
       <w:sz w:val="20"/>
     </w:rPr>
   </w:style>
-  <w:style w:type="paragraph" w:styleId="TOC5">
+  <w:style w:type="paragraph" w:styleId="Verzeichnis5">
     <w:name w:val="toc 5"/>
-    <w:basedOn w:val="TOC4"/>
-    <w:next w:val="Normal"/>
+    <w:basedOn w:val="Verzeichnis4"/>
+    <w:next w:val="Standard"/>
     <w:autoRedefine/>
     <w:uiPriority w:val="39"/>
     <w:unhideWhenUsed/>
@@ -3852,10 +3694,10 @@
       <w:i/>
     </w:rPr>
   </w:style>
-  <w:style w:type="paragraph" w:styleId="FootnoteText">
+  <w:style w:type="paragraph" w:styleId="Funotentext">
     <w:name w:val="footnote text"/>
-    <w:basedOn w:val="Normal"/>
-    <w:link w:val="FootnoteTextChar"/>
+    <w:basedOn w:val="Standard"/>
+    <w:link w:val="FunotentextZchn"/>
     <w:uiPriority w:val="99"/>
     <w:rsid w:val="005E194E"/>
     <w:pPr>
@@ -3869,9 +3711,9 @@
       <w:sz w:val="20"/>
     </w:rPr>
   </w:style>
-  <w:style w:type="character" w:customStyle="1" w:styleId="FootnoteTextChar">
-    <w:name w:val="Footnote Text Char"/>
-    <w:link w:val="FootnoteText"/>
+  <w:style w:type="character" w:customStyle="1" w:styleId="FunotentextZchn">
+    <w:name w:val="Fußnotentext Zchn"/>
+    <w:link w:val="Funotentext"/>
     <w:uiPriority w:val="99"/>
     <w:rsid w:val="005E194E"/>
     <w:rPr>
@@ -3879,7 +3721,7 @@
       <w:color w:val="000000"/>
     </w:rPr>
   </w:style>
-  <w:style w:type="character" w:styleId="FootnoteReference">
+  <w:style w:type="character" w:styleId="Funotenzeichen">
     <w:name w:val="footnote reference"/>
     <w:uiPriority w:val="99"/>
     <w:rsid w:val="008C16BD"/>
@@ -3887,10 +3729,10 @@
       <w:vertAlign w:val="superscript"/>
     </w:rPr>
   </w:style>
-  <w:style w:type="paragraph" w:styleId="BalloonText">
+  <w:style w:type="paragraph" w:styleId="Sprechblasentext">
     <w:name w:val="Balloon Text"/>
-    <w:basedOn w:val="Normal"/>
-    <w:link w:val="BalloonTextChar"/>
+    <w:basedOn w:val="Standard"/>
+    <w:link w:val="SprechblasentextZchn"/>
     <w:uiPriority w:val="99"/>
     <w:semiHidden/>
     <w:unhideWhenUsed/>
@@ -3904,9 +3746,9 @@
       <w:szCs w:val="16"/>
     </w:rPr>
   </w:style>
-  <w:style w:type="character" w:customStyle="1" w:styleId="BalloonTextChar">
-    <w:name w:val="Balloon Text Char"/>
-    <w:link w:val="BalloonText"/>
+  <w:style w:type="character" w:customStyle="1" w:styleId="SprechblasentextZchn">
+    <w:name w:val="Sprechblasentext Zchn"/>
+    <w:link w:val="Sprechblasentext"/>
     <w:uiPriority w:val="99"/>
     <w:semiHidden/>
     <w:rsid w:val="00E41268"/>
@@ -3917,10 +3759,10 @@
       <w:szCs w:val="16"/>
     </w:rPr>
   </w:style>
-  <w:style w:type="paragraph" w:styleId="Caption">
+  <w:style w:type="paragraph" w:styleId="Beschriftung">
     <w:name w:val="caption"/>
-    <w:basedOn w:val="Normal"/>
-    <w:next w:val="Normal"/>
+    <w:basedOn w:val="Standard"/>
+    <w:next w:val="Standard"/>
     <w:uiPriority w:val="13"/>
     <w:unhideWhenUsed/>
     <w:qFormat/>
@@ -3937,10 +3779,10 @@
       <w:szCs w:val="18"/>
     </w:rPr>
   </w:style>
-  <w:style w:type="paragraph" w:styleId="TableofFigures">
+  <w:style w:type="paragraph" w:styleId="Abbildungsverzeichnis">
     <w:name w:val="table of figures"/>
-    <w:basedOn w:val="Normal"/>
-    <w:next w:val="Normal"/>
+    <w:basedOn w:val="Standard"/>
+    <w:next w:val="Standard"/>
     <w:uiPriority w:val="99"/>
     <w:unhideWhenUsed/>
     <w:rsid w:val="000D473A"/>
@@ -3953,10 +3795,10 @@
       <w:ind w:left="1701" w:hanging="1701"/>
     </w:pPr>
   </w:style>
-  <w:style w:type="paragraph" w:styleId="CommentText">
+  <w:style w:type="paragraph" w:styleId="Kommentartext">
     <w:name w:val="annotation text"/>
-    <w:basedOn w:val="Normal"/>
-    <w:link w:val="CommentTextChar"/>
+    <w:basedOn w:val="Standard"/>
+    <w:link w:val="KommentartextZchn"/>
     <w:semiHidden/>
     <w:rsid w:val="007D4925"/>
     <w:pPr>
@@ -3983,9 +3825,9 @@
       <w:lang w:eastAsia="de-DE"/>
     </w:rPr>
   </w:style>
-  <w:style w:type="character" w:customStyle="1" w:styleId="CommentTextChar">
-    <w:name w:val="Comment Text Char"/>
-    <w:link w:val="CommentText"/>
+  <w:style w:type="character" w:customStyle="1" w:styleId="KommentartextZchn">
+    <w:name w:val="Kommentartext Zchn"/>
+    <w:link w:val="Kommentartext"/>
     <w:semiHidden/>
     <w:rsid w:val="007D4925"/>
     <w:rPr>
@@ -3994,7 +3836,7 @@
       <w:lang w:eastAsia="de-DE"/>
     </w:rPr>
   </w:style>
-  <w:style w:type="character" w:styleId="CommentReference">
+  <w:style w:type="character" w:styleId="Kommentarzeichen">
     <w:name w:val="annotation reference"/>
     <w:semiHidden/>
     <w:rsid w:val="007D4925"/>
@@ -4002,10 +3844,10 @@
       <w:sz w:val="16"/>
     </w:rPr>
   </w:style>
-  <w:style w:type="paragraph" w:styleId="BodyText2">
+  <w:style w:type="paragraph" w:styleId="Textkrper2">
     <w:name w:val="Body Text 2"/>
-    <w:basedOn w:val="Normal"/>
-    <w:link w:val="BodyText2Char"/>
+    <w:basedOn w:val="Standard"/>
+    <w:link w:val="Textkrper2Zchn"/>
     <w:uiPriority w:val="99"/>
     <w:semiHidden/>
     <w:unhideWhenUsed/>
@@ -4015,10 +3857,10 @@
       <w:jc w:val="both"/>
     </w:pPr>
   </w:style>
-  <w:style w:type="character" w:customStyle="1" w:styleId="BodyText2Char">
-    <w:name w:val="Body Text 2 Char"/>
-    <w:basedOn w:val="DefaultParagraphFont"/>
-    <w:link w:val="BodyText2"/>
+  <w:style w:type="character" w:customStyle="1" w:styleId="Textkrper2Zchn">
+    <w:name w:val="Textkörper 2 Zchn"/>
+    <w:basedOn w:val="Absatz-Standardschriftart"/>
+    <w:link w:val="Textkrper2"/>
     <w:uiPriority w:val="99"/>
     <w:semiHidden/>
     <w:rsid w:val="0087578D"/>
@@ -4029,10 +3871,10 @@
       <w:lang w:val="de-CH" w:eastAsia="en-US"/>
     </w:rPr>
   </w:style>
-  <w:style w:type="paragraph" w:styleId="BodyText3">
+  <w:style w:type="paragraph" w:styleId="Textkrper3">
     <w:name w:val="Body Text 3"/>
-    <w:basedOn w:val="Normal"/>
-    <w:link w:val="BodyText3Char"/>
+    <w:basedOn w:val="Standard"/>
+    <w:link w:val="Textkrper3Zchn"/>
     <w:uiPriority w:val="99"/>
     <w:semiHidden/>
     <w:unhideWhenUsed/>
@@ -4045,10 +3887,10 @@
       <w:szCs w:val="16"/>
     </w:rPr>
   </w:style>
-  <w:style w:type="character" w:customStyle="1" w:styleId="BodyText3Char">
-    <w:name w:val="Body Text 3 Char"/>
-    <w:basedOn w:val="DefaultParagraphFont"/>
-    <w:link w:val="BodyText3"/>
+  <w:style w:type="character" w:customStyle="1" w:styleId="Textkrper3Zchn">
+    <w:name w:val="Textkörper 3 Zchn"/>
+    <w:basedOn w:val="Absatz-Standardschriftart"/>
+    <w:link w:val="Textkrper3"/>
     <w:uiPriority w:val="99"/>
     <w:semiHidden/>
     <w:rsid w:val="0087578D"/>

</xml_diff>